<commit_message>
Comparison figure: label all requested bands, weak ones marked as tentative
Co-Authored-By: Claude Opus 5.5 <noreply@anthropic.com>
Claude-Session: https://claude.ai/code/session_01L8hQ8e5u5KmaH4dD9snyRw
</commit_message>
<xml_diff>
--- a/EV_NV_Spectra_Comparison_Code.docx
+++ b/EV_NV_Spectra_Comparison_Code.docx
@@ -221,7 +221,7 @@
           <w:sz w:val="15"/>
           <w:noProof/>
         </w:rPr>
-        <w:t># maximum) after removing a straight local background over +/-30 cm-1. A label</w:t>
+        <w:t># maximum) after removing a straight local background over +/-30 cm-1.</w:t>
       </w:r>
     </w:p>
     <w:p>
@@ -234,7 +234,20 @@
           <w:sz w:val="15"/>
           <w:noProof/>
         </w:rPr>
-        <w:t># is drawn only if the peak rises &gt; 2.5 x the noise of that spectrum.</w:t>
+        <w:t># Peaks rising &gt; 2.5 x the noise of that spectrum are labelled normally; weaker</w:t>
+      </w:r>
+    </w:p>
+    <w:p>
+      <w:pPr>
+        <w:spacing w:before="0" w:after="0" w:line="240" w:lineRule="auto"/>
+      </w:pPr>
+      <w:r>
+        <w:rPr>
+          <w:rFonts w:ascii="Consolas" w:hAnsi="Consolas" w:eastAsia="Consolas" w:cs="Consolas"/>
+          <w:sz w:val="15"/>
+          <w:noProof/>
+        </w:rPr>
+        <w:t># features are labelled in italics with '~' (tentative), as stated on the figure.</w:t>
       </w:r>
     </w:p>
     <w:p>
@@ -581,7 +594,7 @@
           <w:sz w:val="15"/>
           <w:noProof/>
         </w:rPr>
-        <w:t>SNR_MIN = 2.5           # minimum peak height / noise for a label</w:t>
+        <w:t>SNR_MIN = 2.5           # below this peak height / noise a label is marked '~' (weak)</w:t>
       </w:r>
     </w:p>
     <w:p>
@@ -594,7 +607,7 @@
           <w:sz w:val="15"/>
           <w:noProof/>
         </w:rPr>
-        <w:t>BOXES = [(788, 875), (1195, 1300), (1560, 1665)]   # dashed comparison regions</w:t>
+        <w:t>BOXES = [(775, 875), (1195, 1300), (1560, 1665)]   # dashed comparison regions</w:t>
       </w:r>
     </w:p>
     <w:p>
@@ -632,7 +645,20 @@
           <w:sz w:val="15"/>
           <w:noProof/>
         </w:rPr>
-        <w:t># where = 'up', 'up-left' or 'up-right': label above the peak (shifted aside for close pairs)</w:t>
+        <w:t># where = 'up', 'up-left' or 'up-right': label above the peak (shifted aside for close pairs);</w:t>
+      </w:r>
+    </w:p>
+    <w:p>
+      <w:pPr>
+        <w:spacing w:before="0" w:after="0" w:line="240" w:lineRule="auto"/>
+      </w:pPr>
+      <w:r>
+        <w:rPr>
+          <w:rFonts w:ascii="Consolas" w:hAnsi="Consolas" w:eastAsia="Consolas" w:cs="Consolas"/>
+          <w:sz w:val="15"/>
+          <w:noProof/>
+        </w:rPr>
+        <w:t># 'pair-1' + 'pair-2': two bands of a doublet drawn as one label (e.g. 825/852)</w:t>
       </w:r>
     </w:p>
     <w:p>
@@ -684,7 +710,33 @@
           <w:sz w:val="15"/>
           <w:noProof/>
         </w:rPr>
-        <w:t xml:space="preserve">        (797, 'Nucleic acids', 'O-P-O backbone stretching', 'up'),</w:t>
+        <w:t xml:space="preserve">        (797, 'Nucleic acids', 'O-P-O backbone stretching', 'up-left'),</w:t>
+      </w:r>
+    </w:p>
+    <w:p>
+      <w:pPr>
+        <w:spacing w:before="0" w:after="0" w:line="240" w:lineRule="auto"/>
+      </w:pPr>
+      <w:r>
+        <w:rPr>
+          <w:rFonts w:ascii="Consolas" w:hAnsi="Consolas" w:eastAsia="Consolas" w:cs="Consolas"/>
+          <w:sz w:val="15"/>
+          <w:noProof/>
+        </w:rPr>
+        <w:t xml:space="preserve">        (826, 'Proteins', 'Tyr Fermi doublet', 'pair-1'),</w:t>
+      </w:r>
+    </w:p>
+    <w:p>
+      <w:pPr>
+        <w:spacing w:before="0" w:after="0" w:line="240" w:lineRule="auto"/>
+      </w:pPr>
+      <w:r>
+        <w:rPr>
+          <w:rFonts w:ascii="Consolas" w:hAnsi="Consolas" w:eastAsia="Consolas" w:cs="Consolas"/>
+          <w:sz w:val="15"/>
+          <w:noProof/>
+        </w:rPr>
+        <w:t xml:space="preserve">        (855, 'Proteins', 'Tyr Fermi doublet', 'pair-2'),</w:t>
       </w:r>
     </w:p>
     <w:p>
@@ -827,6 +879,19 @@
           <w:sz w:val="15"/>
           <w:noProof/>
         </w:rPr>
+        <w:t xml:space="preserve">        (1043, 'Proteins', 'Phe C-H in-plane bending', 'up'),</w:t>
+      </w:r>
+    </w:p>
+    <w:p>
+      <w:pPr>
+        <w:spacing w:before="0" w:after="0" w:line="240" w:lineRule="auto"/>
+      </w:pPr>
+      <w:r>
+        <w:rPr>
+          <w:rFonts w:ascii="Consolas" w:hAnsi="Consolas" w:eastAsia="Consolas" w:cs="Consolas"/>
+          <w:sz w:val="15"/>
+          <w:noProof/>
+        </w:rPr>
         <w:t xml:space="preserve">        (1206, 'Proteins', 'Phe/Tyr C-C6H5 stretching', 'up'),</w:t>
       </w:r>
     </w:p>
@@ -1521,7 +1586,7 @@
           <w:sz w:val="15"/>
           <w:noProof/>
         </w:rPr>
-        <w:t xml:space="preserve">        drawn = snr &gt;= SNR_MIN</w:t>
+        <w:t xml:space="preserve">        weak = snr &lt; SNR_MIN</w:t>
       </w:r>
     </w:p>
     <w:p>
@@ -1547,7 +1612,7 @@
           <w:sz w:val="15"/>
           <w:noProof/>
         </w:rPr>
-        <w:t xml:space="preserve">                     'yes' if drawn else 'no (below SNR limit)'])</w:t>
+        <w:t xml:space="preserve">                     'weak - tentative (~)' if weak else 'yes'])</w:t>
       </w:r>
     </w:p>
     <w:p>
@@ -1560,7 +1625,46 @@
           <w:sz w:val="15"/>
           <w:noProof/>
         </w:rPr>
-        <w:t xml:space="preserve">        if not drawn:</w:t>
+        <w:t xml:space="preserve">        top = y[np.abs(x - pos) &lt;= 4].max() + off</w:t>
+      </w:r>
+    </w:p>
+    <w:p>
+      <w:pPr>
+        <w:spacing w:before="0" w:after="0" w:line="240" w:lineRule="auto"/>
+      </w:pPr>
+      <w:r>
+        <w:rPr>
+          <w:rFonts w:ascii="Consolas" w:hAnsi="Consolas" w:eastAsia="Consolas" w:cs="Consolas"/>
+          <w:sz w:val="15"/>
+          <w:noProof/>
+        </w:rPr>
+        <w:t xml:space="preserve">        txt = f'{"~" if weak else ""}{pos:.0f}{" sh" if sh else ""}'</w:t>
+      </w:r>
+    </w:p>
+    <w:p>
+      <w:pPr>
+        <w:spacing w:before="0" w:after="0" w:line="240" w:lineRule="auto"/>
+      </w:pPr>
+      <w:r>
+        <w:rPr>
+          <w:rFonts w:ascii="Consolas" w:hAnsi="Consolas" w:eastAsia="Consolas" w:cs="Consolas"/>
+          <w:sz w:val="15"/>
+          <w:noProof/>
+        </w:rPr>
+        <w:t xml:space="preserve">        if where == 'pair-1':              # first band of a doublet: drawn with the second</w:t>
+      </w:r>
+    </w:p>
+    <w:p>
+      <w:pPr>
+        <w:spacing w:before="0" w:after="0" w:line="240" w:lineRule="auto"/>
+      </w:pPr>
+      <w:r>
+        <w:rPr>
+          <w:rFonts w:ascii="Consolas" w:hAnsi="Consolas" w:eastAsia="Consolas" w:cs="Consolas"/>
+          <w:sz w:val="15"/>
+          <w:noProof/>
+        </w:rPr>
+        <w:t xml:space="preserve">            pair = (pos, txt, top, weak)</w:t>
       </w:r>
     </w:p>
     <w:p>
@@ -1586,7 +1690,7 @@
           <w:sz w:val="15"/>
           <w:noProof/>
         </w:rPr>
-        <w:t xml:space="preserve">        top = y[np.abs(x - pos) &lt;= 4].max() + off</w:t>
+        <w:t xml:space="preserve">        if where == 'pair-2':</w:t>
       </w:r>
     </w:p>
     <w:p>
@@ -1599,7 +1703,33 @@
           <w:sz w:val="15"/>
           <w:noProof/>
         </w:rPr>
-        <w:t xml:space="preserve">        txt = f'{pos:.0f}' if cls == 'Si' else f'{pos:.0f}{" sh" if sh else ""} - {cls}'</w:t>
+        <w:t xml:space="preserve">            txt = f'{pair[1]}/{txt}'</w:t>
+      </w:r>
+    </w:p>
+    <w:p>
+      <w:pPr>
+        <w:spacing w:before="0" w:after="0" w:line="240" w:lineRule="auto"/>
+      </w:pPr>
+      <w:r>
+        <w:rPr>
+          <w:rFonts w:ascii="Consolas" w:hAnsi="Consolas" w:eastAsia="Consolas" w:cs="Consolas"/>
+          <w:sz w:val="15"/>
+          <w:noProof/>
+        </w:rPr>
+        <w:t xml:space="preserve">            pos, top, weak, where = (pair[0] + pos) / 2, max(pair[2], top), pair[3] or weak, 'up'</w:t>
+      </w:r>
+    </w:p>
+    <w:p>
+      <w:pPr>
+        <w:spacing w:before="0" w:after="0" w:line="240" w:lineRule="auto"/>
+      </w:pPr>
+      <w:r>
+        <w:rPr>
+          <w:rFonts w:ascii="Consolas" w:hAnsi="Consolas" w:eastAsia="Consolas" w:cs="Consolas"/>
+          <w:sz w:val="15"/>
+          <w:noProof/>
+        </w:rPr>
+        <w:t xml:space="preserve">        txt += '' if cls == 'Si' else f' - {cls}'</w:t>
       </w:r>
     </w:p>
     <w:p>
@@ -1664,7 +1794,7 @@
           <w:sz w:val="15"/>
           <w:noProof/>
         </w:rPr>
-        <w:t xml:space="preserve">                color=CLASS_COL[cls])</w:t>
+        <w:t xml:space="preserve">                color=CLASS_COL[cls], style='italic' if weak else 'normal')</w:t>
       </w:r>
     </w:p>
     <w:p>
@@ -1898,6 +2028,45 @@
           <w:noProof/>
         </w:rPr>
         <w:t xml:space="preserve">        bbox=dict(fc='#FFFF00', ec='none', pad=2))</w:t>
+      </w:r>
+    </w:p>
+    <w:p>
+      <w:pPr>
+        <w:spacing w:before="0" w:after="0" w:line="240" w:lineRule="auto"/>
+      </w:pPr>
+      <w:r>
+        <w:rPr>
+          <w:rFonts w:ascii="Consolas" w:hAnsi="Consolas" w:eastAsia="Consolas" w:cs="Consolas"/>
+          <w:sz w:val="15"/>
+          <w:noProof/>
+        </w:rPr>
+        <w:t>ax.text(0.01, 0.60, f'~ weak band (&lt; {SNR_MIN} x noise), tentative;  sh = shoulder',</w:t>
+      </w:r>
+    </w:p>
+    <w:p>
+      <w:pPr>
+        <w:spacing w:before="0" w:after="0" w:line="240" w:lineRule="auto"/>
+      </w:pPr>
+      <w:r>
+        <w:rPr>
+          <w:rFonts w:ascii="Consolas" w:hAnsi="Consolas" w:eastAsia="Consolas" w:cs="Consolas"/>
+          <w:sz w:val="15"/>
+          <w:noProof/>
+        </w:rPr>
+        <w:t xml:space="preserve">        transform=ax.transAxes, ha='left', va='top', fontsize=9, style='italic',</w:t>
+      </w:r>
+    </w:p>
+    <w:p>
+      <w:pPr>
+        <w:spacing w:before="0" w:after="0" w:line="240" w:lineRule="auto"/>
+      </w:pPr>
+      <w:r>
+        <w:rPr>
+          <w:rFonts w:ascii="Consolas" w:hAnsi="Consolas" w:eastAsia="Consolas" w:cs="Consolas"/>
+          <w:sz w:val="15"/>
+          <w:noProof/>
+        </w:rPr>
+        <w:t xml:space="preserve">        bbox=dict(fc='white', ec='none', pad=1), zorder=5)</w:t>
       </w:r>
     </w:p>
     <w:p>

</xml_diff>

<commit_message>
Comparison figure: two-colour labels, original sample tags and box positions
Co-Authored-By: Claude Opus 5.5 <noreply@anthropic.com>
Claude-Session: https://claude.ai/code/session_01L8hQ8e5u5KmaH4dD9snyRw
</commit_message>
<xml_diff>
--- a/EV_NV_Spectra_Comparison_Code.docx
+++ b/EV_NV_Spectra_Comparison_Code.docx
@@ -607,7 +607,7 @@
           <w:sz w:val="15"/>
           <w:noProof/>
         </w:rPr>
-        <w:t>BOXES = [(775, 875), (1195, 1300), (1560, 1665)]   # dashed comparison regions</w:t>
+        <w:t>BOXES = [(775, 890), (1195, 1320), (1515, 1690)]   # dashed comparison regions</w:t>
       </w:r>
     </w:p>
     <w:p>
@@ -1482,7 +1482,187 @@
           <w:sz w:val="15"/>
           <w:noProof/>
         </w:rPr>
-        <w:t>rows = []</w:t>
+        <w:t>def two_colour_label(ax, xpos, ybase, num, cls, ha, weak):</w:t>
+      </w:r>
+    </w:p>
+    <w:p>
+      <w:pPr>
+        <w:spacing w:before="0" w:after="0" w:line="240" w:lineRule="auto"/>
+      </w:pPr>
+      <w:r>
+        <w:rPr>
+          <w:rFonts w:ascii="Consolas" w:hAnsi="Consolas" w:eastAsia="Consolas" w:cs="Consolas"/>
+          <w:sz w:val="15"/>
+          <w:noProof/>
+        </w:rPr>
+        <w:t xml:space="preserve">    """Vertical label: wavenumber in black, then '-Class' in the class colour."""</w:t>
+      </w:r>
+    </w:p>
+    <w:p>
+      <w:pPr>
+        <w:spacing w:before="0" w:after="0" w:line="240" w:lineRule="auto"/>
+      </w:pPr>
+      <w:r>
+        <w:rPr>
+          <w:rFonts w:ascii="Consolas" w:hAnsi="Consolas" w:eastAsia="Consolas" w:cs="Consolas"/>
+          <w:sz w:val="15"/>
+          <w:noProof/>
+        </w:rPr>
+        <w:t xml:space="preserve">    style = 'italic' if weak else 'normal'</w:t>
+      </w:r>
+    </w:p>
+    <w:p>
+      <w:pPr>
+        <w:spacing w:before="0" w:after="0" w:line="240" w:lineRule="auto"/>
+      </w:pPr>
+      <w:r>
+        <w:rPr>
+          <w:rFonts w:ascii="Consolas" w:hAnsi="Consolas" w:eastAsia="Consolas" w:cs="Consolas"/>
+          <w:sz w:val="15"/>
+          <w:noProof/>
+        </w:rPr>
+        <w:t xml:space="preserve">    t = ax.text(xpos, ybase, num, rotation=90, va='bottom', ha=ha, fontsize=10,</w:t>
+      </w:r>
+    </w:p>
+    <w:p>
+      <w:pPr>
+        <w:spacing w:before="0" w:after="0" w:line="240" w:lineRule="auto"/>
+      </w:pPr>
+      <w:r>
+        <w:rPr>
+          <w:rFonts w:ascii="Consolas" w:hAnsi="Consolas" w:eastAsia="Consolas" w:cs="Consolas"/>
+          <w:sz w:val="15"/>
+          <w:noProof/>
+        </w:rPr>
+        <w:t xml:space="preserve">                color='k', style=style)</w:t>
+      </w:r>
+    </w:p>
+    <w:p>
+      <w:pPr>
+        <w:spacing w:before="0" w:after="0" w:line="240" w:lineRule="auto"/>
+      </w:pPr>
+      <w:r>
+        <w:rPr>
+          <w:rFonts w:ascii="Consolas" w:hAnsi="Consolas" w:eastAsia="Consolas" w:cs="Consolas"/>
+          <w:sz w:val="15"/>
+          <w:noProof/>
+        </w:rPr>
+        <w:t xml:space="preserve">    if cls == 'Si':</w:t>
+      </w:r>
+    </w:p>
+    <w:p>
+      <w:pPr>
+        <w:spacing w:before="0" w:after="0" w:line="240" w:lineRule="auto"/>
+      </w:pPr>
+      <w:r>
+        <w:rPr>
+          <w:rFonts w:ascii="Consolas" w:hAnsi="Consolas" w:eastAsia="Consolas" w:cs="Consolas"/>
+          <w:sz w:val="15"/>
+          <w:noProof/>
+        </w:rPr>
+        <w:t xml:space="preserve">        return</w:t>
+      </w:r>
+    </w:p>
+    <w:p>
+      <w:pPr>
+        <w:spacing w:before="0" w:after="0" w:line="240" w:lineRule="auto"/>
+      </w:pPr>
+      <w:r>
+        <w:rPr>
+          <w:rFonts w:ascii="Consolas" w:hAnsi="Consolas" w:eastAsia="Consolas" w:cs="Consolas"/>
+          <w:sz w:val="15"/>
+          <w:noProof/>
+        </w:rPr>
+        <w:t xml:space="preserve">    ax.figure.canvas.draw()</w:t>
+      </w:r>
+    </w:p>
+    <w:p>
+      <w:pPr>
+        <w:spacing w:before="0" w:after="0" w:line="240" w:lineRule="auto"/>
+      </w:pPr>
+      <w:r>
+        <w:rPr>
+          <w:rFonts w:ascii="Consolas" w:hAnsi="Consolas" w:eastAsia="Consolas" w:cs="Consolas"/>
+          <w:sz w:val="15"/>
+          <w:noProof/>
+        </w:rPr>
+        <w:t xml:space="preserve">    bb = t.get_window_extent().transformed(ax.transData.inverted())</w:t>
+      </w:r>
+    </w:p>
+    <w:p>
+      <w:pPr>
+        <w:spacing w:before="0" w:after="0" w:line="240" w:lineRule="auto"/>
+      </w:pPr>
+      <w:r>
+        <w:rPr>
+          <w:rFonts w:ascii="Consolas" w:hAnsi="Consolas" w:eastAsia="Consolas" w:cs="Consolas"/>
+          <w:sz w:val="15"/>
+          <w:noProof/>
+        </w:rPr>
+        <w:t xml:space="preserve">    gap = 0.004 * (ax.get_ylim()[1] - ax.get_ylim()[0])   # remove the font's end padding</w:t>
+      </w:r>
+    </w:p>
+    <w:p>
+      <w:pPr>
+        <w:spacing w:before="0" w:after="0" w:line="240" w:lineRule="auto"/>
+      </w:pPr>
+      <w:r>
+        <w:rPr>
+          <w:rFonts w:ascii="Consolas" w:hAnsi="Consolas" w:eastAsia="Consolas" w:cs="Consolas"/>
+          <w:sz w:val="15"/>
+          <w:noProof/>
+        </w:rPr>
+        <w:t xml:space="preserve">    ax.text(xpos, bb.y1 - gap, f'-{cls}', rotation=90, va='bottom', ha=ha, fontsize=10,</w:t>
+      </w:r>
+    </w:p>
+    <w:p>
+      <w:pPr>
+        <w:spacing w:before="0" w:after="0" w:line="240" w:lineRule="auto"/>
+      </w:pPr>
+      <w:r>
+        <w:rPr>
+          <w:rFonts w:ascii="Consolas" w:hAnsi="Consolas" w:eastAsia="Consolas" w:cs="Consolas"/>
+          <w:sz w:val="15"/>
+          <w:noProof/>
+        </w:rPr>
+        <w:t xml:space="preserve">            color=CLASS_COL[cls], style=style)</w:t>
+      </w:r>
+    </w:p>
+    <w:p>
+      <w:pPr>
+        <w:spacing w:before="0" w:after="0" w:line="240" w:lineRule="auto"/>
+      </w:pPr>
+      <w:r>
+        <w:rPr>
+          <w:rFonts w:ascii="Consolas" w:hAnsi="Consolas" w:eastAsia="Consolas" w:cs="Consolas"/>
+          <w:sz w:val="15"/>
+          <w:noProof/>
+        </w:rPr>
+      </w:r>
+    </w:p>
+    <w:p>
+      <w:pPr>
+        <w:spacing w:before="0" w:after="0" w:line="240" w:lineRule="auto"/>
+      </w:pPr>
+      <w:r>
+        <w:rPr>
+          <w:rFonts w:ascii="Consolas" w:hAnsi="Consolas" w:eastAsia="Consolas" w:cs="Consolas"/>
+          <w:sz w:val="15"/>
+          <w:noProof/>
+        </w:rPr>
+      </w:r>
+    </w:p>
+    <w:p>
+      <w:pPr>
+        <w:spacing w:before="0" w:after="0" w:line="240" w:lineRule="auto"/>
+      </w:pPr>
+      <w:r>
+        <w:rPr>
+          <w:rFonts w:ascii="Consolas" w:hAnsi="Consolas" w:eastAsia="Consolas" w:cs="Consolas"/>
+          <w:sz w:val="15"/>
+          <w:noProof/>
+        </w:rPr>
+        <w:t>rows, labels = [], []</w:t>
       </w:r>
     </w:p>
     <w:p>
@@ -1729,19 +1909,6 @@
           <w:sz w:val="15"/>
           <w:noProof/>
         </w:rPr>
-        <w:t xml:space="preserve">        txt += '' if cls == 'Si' else f' - {cls}'</w:t>
-      </w:r>
-    </w:p>
-    <w:p>
-      <w:pPr>
-        <w:spacing w:before="0" w:after="0" w:line="240" w:lineRule="auto"/>
-      </w:pPr>
-      <w:r>
-        <w:rPr>
-          <w:rFonts w:ascii="Consolas" w:hAnsi="Consolas" w:eastAsia="Consolas" w:cs="Consolas"/>
-          <w:sz w:val="15"/>
-          <w:noProof/>
-        </w:rPr>
         <w:t xml:space="preserve">        top = y[np.abs(x - pos) &lt;= 25].max() + off if where != 'up' else top</w:t>
       </w:r>
     </w:p>
@@ -1768,7 +1935,7 @@
           <w:sz w:val="15"/>
           <w:noProof/>
         </w:rPr>
-        <w:t xml:space="preserve">        ax.text(pos + dx, top + 8, txt, rotation=90, va='bottom', fontsize=10,</w:t>
+        <w:t xml:space="preserve">        labels.append((pos + dx, top + 8, txt, cls,</w:t>
       </w:r>
     </w:p>
     <w:p>
@@ -1781,20 +1948,7 @@
           <w:sz w:val="15"/>
           <w:noProof/>
         </w:rPr>
-        <w:t xml:space="preserve">                ha={'up': 'center', 'up-left': 'right', 'up-right': 'left'}[where],</w:t>
-      </w:r>
-    </w:p>
-    <w:p>
-      <w:pPr>
-        <w:spacing w:before="0" w:after="0" w:line="240" w:lineRule="auto"/>
-      </w:pPr>
-      <w:r>
-        <w:rPr>
-          <w:rFonts w:ascii="Consolas" w:hAnsi="Consolas" w:eastAsia="Consolas" w:cs="Consolas"/>
-          <w:sz w:val="15"/>
-          <w:noProof/>
-        </w:rPr>
-        <w:t xml:space="preserve">                color=CLASS_COL[cls], style='italic' if weak else 'normal')</w:t>
+        <w:t xml:space="preserve">                       {'up': 'center', 'up-left': 'right', 'up-right': 'left'}[where], weak))</w:t>
       </w:r>
     </w:p>
     <w:p>
@@ -1910,7 +2064,7 @@
           <w:sz w:val="15"/>
           <w:noProof/>
         </w:rPr>
-        <w:t>ax.set_yticks([])</w:t>
+        <w:t>for lab in labels:                       # after the axis limits are fixed</w:t>
       </w:r>
     </w:p>
     <w:p>
@@ -1923,7 +2077,33 @@
           <w:sz w:val="15"/>
           <w:noProof/>
         </w:rPr>
-        <w:t>ax.tick_params(axis='x', direction='in', length=5)</w:t>
+        <w:t xml:space="preserve">    two_colour_label(ax, *lab)</w:t>
+      </w:r>
+    </w:p>
+    <w:p>
+      <w:pPr>
+        <w:spacing w:before="0" w:after="0" w:line="240" w:lineRule="auto"/>
+      </w:pPr>
+      <w:r>
+        <w:rPr>
+          <w:rFonts w:ascii="Consolas" w:hAnsi="Consolas" w:eastAsia="Consolas" w:cs="Consolas"/>
+          <w:sz w:val="15"/>
+          <w:noProof/>
+        </w:rPr>
+        <w:t>ax.set_yticks([])</w:t>
+      </w:r>
+    </w:p>
+    <w:p>
+      <w:pPr>
+        <w:spacing w:before="0" w:after="0" w:line="240" w:lineRule="auto"/>
+      </w:pPr>
+      <w:r>
+        <w:rPr>
+          <w:rFonts w:ascii="Consolas" w:hAnsi="Consolas" w:eastAsia="Consolas" w:cs="Consolas"/>
+          <w:sz w:val="15"/>
+          <w:noProof/>
+        </w:rPr>
+        <w:t>ax.tick_params(axis='x', direction='in', length=5, top=False)</w:t>
       </w:r>
     </w:p>
     <w:p>
@@ -1962,7 +2142,7 @@
           <w:sz w:val="15"/>
           <w:noProof/>
         </w:rPr>
-        <w:t>ax.text(0.01, 0.985, 'Acacia NVs (s4a) - Ag/SiNWs - 532 nm', transform=ax.transAxes,</w:t>
+        <w:t>ax.text(0.99, 1.012, 'S4a-EV-NanoACACIA-AgSiNWs-532nm', transform=ax.transAxes,</w:t>
       </w:r>
     </w:p>
     <w:p>
@@ -1975,7 +2155,7 @@
           <w:sz w:val="15"/>
           <w:noProof/>
         </w:rPr>
-        <w:t xml:space="preserve">        ha='left', va='top', color=C_NV, fontsize=11,</w:t>
+        <w:t xml:space="preserve">        ha='right', va='bottom', color=C_NV, fontsize=12,</w:t>
       </w:r>
     </w:p>
     <w:p>
@@ -2001,7 +2181,7 @@
           <w:sz w:val="15"/>
           <w:noProof/>
         </w:rPr>
-        <w:t>ax.text(0.99, 0.015, 'Acacia EVs (S1) - Ag/SiNWs - 532 nm', transform=ax.transAxes,</w:t>
+        <w:t>ax.text(0.99, 0.015, 'S1-EV-ACACIA-Ag/SiNWs-532nm', transform=ax.transAxes,</w:t>
       </w:r>
     </w:p>
     <w:p>
@@ -2014,7 +2194,7 @@
           <w:sz w:val="15"/>
           <w:noProof/>
         </w:rPr>
-        <w:t xml:space="preserve">        ha='right', va='bottom', color=C_EV, fontsize=11,</w:t>
+        <w:t xml:space="preserve">        ha='right', va='bottom', color=C_EV, fontsize=12,</w:t>
       </w:r>
     </w:p>
     <w:p>

</xml_diff>

<commit_message>
Comparison figure: raw counts with light Savitzky-Golay smoothing (7 pts, 2nd order)
Co-Authored-By: Claude Opus 5.5 <noreply@anthropic.com>
Claude-Session: https://claude.ai/code/session_01L8hQ8e5u5KmaH4dD9snyRw
</commit_message>
<xml_diff>
--- a/EV_NV_Spectra_Comparison_Code.docx
+++ b/EV_NV_Spectra_Comparison_Code.docx
@@ -143,7 +143,7 @@
           <w:sz w:val="15"/>
           <w:noProof/>
         </w:rPr>
-        <w:t># Raw counts are plotted (no smoothing, no baseline, no normalisation). The NV</w:t>
+        <w:t># Raw counts are plotted with light Savitzky-Golay smoothing only (SMOOTH_WINDOW</w:t>
       </w:r>
     </w:p>
     <w:p>
@@ -156,7 +156,20 @@
           <w:sz w:val="15"/>
           <w:noProof/>
         </w:rPr>
-        <w:t># spectrum is shifted up by a constant (OFFSET) so the two traces do not</w:t>
+        <w:t># points, SMOOTH_ORDER polynomial): no baseline correction, no normalisation.</w:t>
+      </w:r>
+    </w:p>
+    <w:p>
+      <w:pPr>
+        <w:spacing w:before="0" w:after="0" w:line="240" w:lineRule="auto"/>
+      </w:pPr>
+      <w:r>
+        <w:rPr>
+          <w:rFonts w:ascii="Consolas" w:hAnsi="Consolas" w:eastAsia="Consolas" w:cs="Consolas"/>
+          <w:sz w:val="15"/>
+          <w:noProof/>
+        </w:rPr>
+        <w:t># The NV spectrum is shifted up by a constant (OFFSET) so the two traces do not</w:t>
       </w:r>
     </w:p>
     <w:p>
@@ -594,6 +607,19 @@
           <w:sz w:val="15"/>
           <w:noProof/>
         </w:rPr>
+        <w:t>SMOOTH_WINDOW, SMOOTH_ORDER = 7, 2   # light smoothing of the plotted traces</w:t>
+      </w:r>
+    </w:p>
+    <w:p>
+      <w:pPr>
+        <w:spacing w:before="0" w:after="0" w:line="240" w:lineRule="auto"/>
+      </w:pPr>
+      <w:r>
+        <w:rPr>
+          <w:rFonts w:ascii="Consolas" w:hAnsi="Consolas" w:eastAsia="Consolas" w:cs="Consolas"/>
+          <w:sz w:val="15"/>
+          <w:noProof/>
+        </w:rPr>
         <w:t>SNR_MIN = 2.5           # below this peak height / noise a label is marked '~' (weak)</w:t>
       </w:r>
     </w:p>
@@ -1714,7 +1740,20 @@
           <w:sz w:val="15"/>
           <w:noProof/>
         </w:rPr>
-        <w:t xml:space="preserve">    ax.plot(x, y + off, color=col, lw=0.7)</w:t>
+        <w:t xml:space="preserve">    ys_plot = savgol_filter(y, SMOOTH_WINDOW, SMOOTH_ORDER)</w:t>
+      </w:r>
+    </w:p>
+    <w:p>
+      <w:pPr>
+        <w:spacing w:before="0" w:after="0" w:line="240" w:lineRule="auto"/>
+      </w:pPr>
+      <w:r>
+        <w:rPr>
+          <w:rFonts w:ascii="Consolas" w:hAnsi="Consolas" w:eastAsia="Consolas" w:cs="Consolas"/>
+          <w:sz w:val="15"/>
+          <w:noProof/>
+        </w:rPr>
+        <w:t xml:space="preserve">    ax.plot(x, ys_plot + off, color=col, lw=0.8)</w:t>
       </w:r>
     </w:p>
     <w:p>
@@ -1805,7 +1844,7 @@
           <w:sz w:val="15"/>
           <w:noProof/>
         </w:rPr>
-        <w:t xml:space="preserve">        top = y[np.abs(x - pos) &lt;= 4].max() + off</w:t>
+        <w:t xml:space="preserve">        top = ys_plot[np.abs(x - pos) &lt;= 4].max() + off</w:t>
       </w:r>
     </w:p>
     <w:p>
@@ -1909,7 +1948,7 @@
           <w:sz w:val="15"/>
           <w:noProof/>
         </w:rPr>
-        <w:t xml:space="preserve">        top = y[np.abs(x - pos) &lt;= 25].max() + off if where != 'up' else top</w:t>
+        <w:t xml:space="preserve">        top = ys_plot[np.abs(x - pos) &lt;= 25].max() + off if where != 'up' else top</w:t>
       </w:r>
     </w:p>
     <w:p>

</xml_diff>

<commit_message>
Comparison figure: sample labels 'EV Acacia on Ag/SiNWs' and 'Nanovesicles Acacia on Ag/SiNWs'
Co-Authored-By: Claude Opus 5.5 <noreply@anthropic.com>
Claude-Session: https://claude.ai/code/session_01L8hQ8e5u5KmaH4dD9snyRw
</commit_message>
<xml_diff>
--- a/EV_NV_Spectra_Comparison_Code.docx
+++ b/EV_NV_Spectra_Comparison_Code.docx
@@ -2181,7 +2181,7 @@
           <w:sz w:val="15"/>
           <w:noProof/>
         </w:rPr>
-        <w:t>ax.text(0.99, 1.012, 'S4a-EV-NanoACACIA-AgSiNWs-532nm', transform=ax.transAxes,</w:t>
+        <w:t>ax.text(0.99, 1.012, 'Nanovesicles Acacia on Ag/SiNWs', transform=ax.transAxes,</w:t>
       </w:r>
     </w:p>
     <w:p>
@@ -2220,7 +2220,7 @@
           <w:sz w:val="15"/>
           <w:noProof/>
         </w:rPr>
-        <w:t>ax.text(0.99, 0.015, 'S1-EV-ACACIA-Ag/SiNWs-532nm', transform=ax.transAxes,</w:t>
+        <w:t>ax.text(0.99, 0.015, 'EV Acacia on Ag/SiNWs', transform=ax.transAxes,</w:t>
       </w:r>
     </w:p>
     <w:p>

</xml_diff>

<commit_message>
Comparison figure: plot raw counts without smoothing
Co-Authored-By: Claude Opus 5.5 <noreply@anthropic.com>
Claude-Session: https://claude.ai/code/session_01L8hQ8e5u5KmaH4dD9snyRw
</commit_message>
<xml_diff>
--- a/EV_NV_Spectra_Comparison_Code.docx
+++ b/EV_NV_Spectra_Comparison_Code.docx
@@ -143,7 +143,7 @@
           <w:sz w:val="15"/>
           <w:noProof/>
         </w:rPr>
-        <w:t># Raw counts are plotted with light Savitzky-Golay smoothing only (SMOOTH_WINDOW</w:t>
+        <w:t># Raw counts are plotted exactly as recorded: no smoothing, no baseline</w:t>
       </w:r>
     </w:p>
     <w:p>
@@ -156,7 +156,7 @@
           <w:sz w:val="15"/>
           <w:noProof/>
         </w:rPr>
-        <w:t># points, SMOOTH_ORDER polynomial): no baseline correction, no normalisation.</w:t>
+        <w:t># correction, no normalisation.</w:t>
       </w:r>
     </w:p>
     <w:p>
@@ -607,19 +607,6 @@
           <w:sz w:val="15"/>
           <w:noProof/>
         </w:rPr>
-        <w:t>SMOOTH_WINDOW, SMOOTH_ORDER = 7, 2   # light smoothing of the plotted traces</w:t>
-      </w:r>
-    </w:p>
-    <w:p>
-      <w:pPr>
-        <w:spacing w:before="0" w:after="0" w:line="240" w:lineRule="auto"/>
-      </w:pPr>
-      <w:r>
-        <w:rPr>
-          <w:rFonts w:ascii="Consolas" w:hAnsi="Consolas" w:eastAsia="Consolas" w:cs="Consolas"/>
-          <w:sz w:val="15"/>
-          <w:noProof/>
-        </w:rPr>
         <w:t>SNR_MIN = 2.5           # below this peak height / noise a label is marked '~' (weak)</w:t>
       </w:r>
     </w:p>
@@ -1740,7 +1727,7 @@
           <w:sz w:val="15"/>
           <w:noProof/>
         </w:rPr>
-        <w:t xml:space="preserve">    ys_plot = savgol_filter(y, SMOOTH_WINDOW, SMOOTH_ORDER)</w:t>
+        <w:t xml:space="preserve">    ys_plot = y                        # raw counts, plotted unchanged</w:t>
       </w:r>
     </w:p>
     <w:p>
@@ -1753,7 +1740,7 @@
           <w:sz w:val="15"/>
           <w:noProof/>
         </w:rPr>
-        <w:t xml:space="preserve">    ax.plot(x, ys_plot + off, color=col, lw=0.8)</w:t>
+        <w:t xml:space="preserve">    ax.plot(x, ys_plot + off, color=col, lw=0.7)</w:t>
       </w:r>
     </w:p>
     <w:p>

</xml_diff>

<commit_message>
Comparison figure: remove yellow highlight from sample labels
Co-Authored-By: Claude Opus 5.5 <noreply@anthropic.com>
Claude-Session: https://claude.ai/code/session_01L8hQ8e5u5KmaH4dD9snyRw
</commit_message>
<xml_diff>
--- a/EV_NV_Spectra_Comparison_Code.docx
+++ b/EV_NV_Spectra_Comparison_Code.docx
@@ -2181,20 +2181,7 @@
           <w:sz w:val="15"/>
           <w:noProof/>
         </w:rPr>
-        <w:t xml:space="preserve">        ha='right', va='bottom', color=C_NV, fontsize=12,</w:t>
-      </w:r>
-    </w:p>
-    <w:p>
-      <w:pPr>
-        <w:spacing w:before="0" w:after="0" w:line="240" w:lineRule="auto"/>
-      </w:pPr>
-      <w:r>
-        <w:rPr>
-          <w:rFonts w:ascii="Consolas" w:hAnsi="Consolas" w:eastAsia="Consolas" w:cs="Consolas"/>
-          <w:sz w:val="15"/>
-          <w:noProof/>
-        </w:rPr>
-        <w:t xml:space="preserve">        bbox=dict(fc='#FFFF00', ec='none', pad=2))</w:t>
+        <w:t xml:space="preserve">        ha='right', va='bottom', color=C_NV, fontsize=12)</w:t>
       </w:r>
     </w:p>
     <w:p>
@@ -2220,20 +2207,7 @@
           <w:sz w:val="15"/>
           <w:noProof/>
         </w:rPr>
-        <w:t xml:space="preserve">        ha='right', va='bottom', color=C_EV, fontsize=12,</w:t>
-      </w:r>
-    </w:p>
-    <w:p>
-      <w:pPr>
-        <w:spacing w:before="0" w:after="0" w:line="240" w:lineRule="auto"/>
-      </w:pPr>
-      <w:r>
-        <w:rPr>
-          <w:rFonts w:ascii="Consolas" w:hAnsi="Consolas" w:eastAsia="Consolas" w:cs="Consolas"/>
-          <w:sz w:val="15"/>
-          <w:noProof/>
-        </w:rPr>
-        <w:t xml:space="preserve">        bbox=dict(fc='#FFFF00', ec='none', pad=2))</w:t>
+        <w:t xml:space="preserve">        ha='right', va='bottom', color=C_EV, fontsize=12)</w:t>
       </w:r>
     </w:p>
     <w:p>

</xml_diff>

<commit_message>
Comparison figure: move EV label clear of the dashed box
Co-Authored-By: Claude Opus 5.5 <noreply@anthropic.com>
Claude-Session: https://claude.ai/code/session_01L8hQ8e5u5KmaH4dD9snyRw
</commit_message>
<xml_diff>
--- a/EV_NV_Spectra_Comparison_Code.docx
+++ b/EV_NV_Spectra_Comparison_Code.docx
@@ -2194,7 +2194,7 @@
           <w:sz w:val="15"/>
           <w:noProof/>
         </w:rPr>
-        <w:t>ax.text(0.99, 0.015, 'EV Acacia on Ag/SiNWs', transform=ax.transAxes,</w:t>
+        <w:t>ax.text(0.01, 0.20, 'EV Acacia on Ag/SiNWs', transform=ax.transAxes,</w:t>
       </w:r>
     </w:p>
     <w:p>
@@ -2207,7 +2207,7 @@
           <w:sz w:val="15"/>
           <w:noProof/>
         </w:rPr>
-        <w:t xml:space="preserve">        ha='right', va='bottom', color=C_EV, fontsize=12)</w:t>
+        <w:t xml:space="preserve">        ha='left', va='bottom', color=C_EV, fontsize=12)</w:t>
       </w:r>
     </w:p>
     <w:p>

</xml_diff>

<commit_message>
Comparison figure: label layout and wording as in the user's original figure
Co-Authored-By: Claude Opus 5.5 <noreply@anthropic.com>
Claude-Session: https://claude.ai/code/session_01L8hQ8e5u5KmaH4dD9snyRw
</commit_message>
<xml_diff>
--- a/EV_NV_Spectra_Comparison_Code.docx
+++ b/EV_NV_Spectra_Comparison_Code.docx
@@ -247,7 +247,7 @@
           <w:sz w:val="15"/>
           <w:noProof/>
         </w:rPr>
-        <w:t># Peaks rising &gt; 2.5 x the noise of that spectrum are labelled normally; weaker</w:t>
+        <w:t># Labels follow the layout of the user's original figure. Bands rising less than</w:t>
       </w:r>
     </w:p>
     <w:p>
@@ -260,7 +260,7 @@
           <w:sz w:val="15"/>
           <w:noProof/>
         </w:rPr>
-        <w:t># features are labelled in italics with '~' (tentative), as stated on the figure.</w:t>
+        <w:t># 2.5 x the noise are flagged as weak in EV_NV_Comparison_peaks.csv (all measured</w:t>
       </w:r>
     </w:p>
     <w:p>
@@ -273,7 +273,7 @@
           <w:sz w:val="15"/>
           <w:noProof/>
         </w:rPr>
-        <w:t># All measured values are written to EV_NV_Comparison_peaks.csv.</w:t>
+        <w:t># values are written there).</w:t>
       </w:r>
     </w:p>
     <w:p>
@@ -607,7 +607,7 @@
           <w:sz w:val="15"/>
           <w:noProof/>
         </w:rPr>
-        <w:t>SNR_MIN = 2.5           # below this peak height / noise a label is marked '~' (weak)</w:t>
+        <w:t>SNR_MIN = 2.5           # below this peak height / noise a band is flagged 'weak' in the CSV</w:t>
       </w:r>
     </w:p>
     <w:p>
@@ -645,7 +645,7 @@
           <w:sz w:val="15"/>
           <w:noProof/>
         </w:rPr>
-        <w:t># nominal position, class shown on the figure, assignment (for the CSV)</w:t>
+        <w:t># nominal position, label class (None = number only), assignment (CSV), placement</w:t>
       </w:r>
     </w:p>
     <w:p>
@@ -658,7 +658,7 @@
           <w:sz w:val="15"/>
           <w:noProof/>
         </w:rPr>
-        <w:t># where = 'up', 'up-left' or 'up-right': label above the peak (shifted aside for close pairs);</w:t>
+        <w:t># placement: 'up' / 'up-left' / 'up-right' = above the peak;</w:t>
       </w:r>
     </w:p>
     <w:p>
@@ -671,7 +671,7 @@
           <w:sz w:val="15"/>
           <w:noProof/>
         </w:rPr>
-        <w:t># 'pair-1' + 'pair-2': two bands of a doublet drawn as one label (e.g. 825/852)</w:t>
+        <w:t># 'pair-1' + 'pair-2' = doublet written as one label (e.g. 826/55)</w:t>
       </w:r>
     </w:p>
     <w:p>
@@ -723,7 +723,7 @@
           <w:sz w:val="15"/>
           <w:noProof/>
         </w:rPr>
-        <w:t xml:space="preserve">        (797, 'Nucleic acids', 'O-P-O backbone stretching', 'up-left'),</w:t>
+        <w:t xml:space="preserve">        (797, 'Nucleic Acids', 'O-P-O backbone stretching', 'up-left'),</w:t>
       </w:r>
     </w:p>
     <w:p>
@@ -762,7 +762,7 @@
           <w:sz w:val="15"/>
           <w:noProof/>
         </w:rPr>
-        <w:t xml:space="preserve">        (1001, 'Proteins', 'Phe ring breathing', 'up'),</w:t>
+        <w:t xml:space="preserve">        (1001, 'Proteins', 'Phe ring breathing', 'up-left'),</w:t>
       </w:r>
     </w:p>
     <w:p>
@@ -775,7 +775,7 @@
           <w:sz w:val="15"/>
           <w:noProof/>
         </w:rPr>
-        <w:t xml:space="preserve">        (1034, 'Proteins', 'Phe C-H in-plane bending', 'up'),</w:t>
+        <w:t xml:space="preserve">        (1034, 'Proteins', 'Phe C-H in-plane bending', 'up-right'),</w:t>
       </w:r>
     </w:p>
     <w:p>
@@ -814,7 +814,7 @@
           <w:sz w:val="15"/>
           <w:noProof/>
         </w:rPr>
-        <w:t xml:space="preserve">        (1607, 'Proteins', 'Phe/Tyr ring C=C stretching', 'up-left'),</w:t>
+        <w:t xml:space="preserve">        (1607, None, 'Phe/Tyr ring C=C stretching (protein)', 'up-left'),</w:t>
       </w:r>
     </w:p>
     <w:p>
@@ -827,7 +827,7 @@
           <w:sz w:val="15"/>
           <w:noProof/>
         </w:rPr>
-        <w:t xml:space="preserve">        (1624, 'Proteins', 'Tyr/Trp ring C=C stretching', 'up-right'),</w:t>
+        <w:t xml:space="preserve">        (1624, None, 'Tyr/Trp ring C=C stretching (protein)', 'up-right'),</w:t>
       </w:r>
     </w:p>
     <w:p>
@@ -866,33 +866,7 @@
           <w:sz w:val="15"/>
           <w:noProof/>
         </w:rPr>
-        <w:t xml:space="preserve">        (519, 'Si', 'Si substrate (crystalline silicon phonon)', 'up'),</w:t>
-      </w:r>
-    </w:p>
-    <w:p>
-      <w:pPr>
-        <w:spacing w:before="0" w:after="0" w:line="240" w:lineRule="auto"/>
-      </w:pPr>
-      <w:r>
-        <w:rPr>
-          <w:rFonts w:ascii="Consolas" w:hAnsi="Consolas" w:eastAsia="Consolas" w:cs="Consolas"/>
-          <w:sz w:val="15"/>
-          <w:noProof/>
-        </w:rPr>
-        <w:t xml:space="preserve">        (1001, 'Proteins', 'Phe ring breathing', 'up'),</w:t>
-      </w:r>
-    </w:p>
-    <w:p>
-      <w:pPr>
-        <w:spacing w:before="0" w:after="0" w:line="240" w:lineRule="auto"/>
-      </w:pPr>
-      <w:r>
-        <w:rPr>
-          <w:rFonts w:ascii="Consolas" w:hAnsi="Consolas" w:eastAsia="Consolas" w:cs="Consolas"/>
-          <w:sz w:val="15"/>
-          <w:noProof/>
-        </w:rPr>
-        <w:t xml:space="preserve">        (1043, 'Proteins', 'Phe C-H in-plane bending', 'up'),</w:t>
+        <w:t xml:space="preserve">        (1043, None, 'Phe C-H in-plane bending', 'up'),</w:t>
       </w:r>
     </w:p>
     <w:p>
@@ -918,7 +892,7 @@
           <w:sz w:val="15"/>
           <w:noProof/>
         </w:rPr>
-        <w:t xml:space="preserve">        (1284, 'Proteins', 'Amide III', 'up'),</w:t>
+        <w:t xml:space="preserve">        (1284, None, 'Amide III', 'up'),</w:t>
       </w:r>
     </w:p>
     <w:p>
@@ -931,7 +905,7 @@
           <w:sz w:val="15"/>
           <w:noProof/>
         </w:rPr>
-        <w:t xml:space="preserve">        (1380, 'Lipids/NA', 'CH3 deformation (lipids) / nucleic-acid bases; COO- on Ag', 'up'),</w:t>
+        <w:t xml:space="preserve">        (1380, None, 'CH3 deformation (lipids) / nucleic-acid bases; COO- on Ag', 'up'),</w:t>
       </w:r>
     </w:p>
     <w:p>
@@ -944,7 +918,7 @@
           <w:sz w:val="15"/>
           <w:noProof/>
         </w:rPr>
-        <w:t xml:space="preserve">        (1604, 'Proteins', 'Phe/Tyr ring C=C stretching', 'up-left'),</w:t>
+        <w:t xml:space="preserve">        (1604, None, 'Phe/Tyr ring C=C stretching', 'up-left'),</w:t>
       </w:r>
     </w:p>
     <w:p>
@@ -957,7 +931,7 @@
           <w:sz w:val="15"/>
           <w:noProof/>
         </w:rPr>
-        <w:t xml:space="preserve">        (1628, 'Proteins', 'Tyr/Trp ring C=C stretching (shoulder)', 'up-right'),</w:t>
+        <w:t xml:space="preserve">        (1628, None, 'Tyr/Trp ring C=C stretching (shoulder)', 'up-right'),</w:t>
       </w:r>
     </w:p>
     <w:p>
@@ -996,7 +970,72 @@
           <w:sz w:val="15"/>
           <w:noProof/>
         </w:rPr>
-        <w:t>CLASS_COL = {'Proteins': '#7030A0', 'Nucleic acids': '#1F3864', 'Lipids/NA': '#2E75B6', 'Si': 'k'}</w:t>
+        <w:t># extra class word written next to a group of numbers (as in the original figure)</w:t>
+      </w:r>
+    </w:p>
+    <w:p>
+      <w:pPr>
+        <w:spacing w:before="0" w:after="0" w:line="240" w:lineRule="auto"/>
+      </w:pPr>
+      <w:r>
+        <w:rPr>
+          <w:rFonts w:ascii="Consolas" w:hAnsi="Consolas" w:eastAsia="Consolas" w:cs="Consolas"/>
+          <w:sz w:val="15"/>
+          <w:noProof/>
+        </w:rPr>
+        <w:t>GROUP_LABELS = [('NV', 1712, 'Proteins')]</w:t>
+      </w:r>
+    </w:p>
+    <w:p>
+      <w:pPr>
+        <w:spacing w:before="0" w:after="0" w:line="240" w:lineRule="auto"/>
+      </w:pPr>
+      <w:r>
+        <w:rPr>
+          <w:rFonts w:ascii="Consolas" w:hAnsi="Consolas" w:eastAsia="Consolas" w:cs="Consolas"/>
+          <w:sz w:val="15"/>
+          <w:noProof/>
+        </w:rPr>
+        <w:t># label text segments: (text, colour)</w:t>
+      </w:r>
+    </w:p>
+    <w:p>
+      <w:pPr>
+        <w:spacing w:before="0" w:after="0" w:line="240" w:lineRule="auto"/>
+      </w:pPr>
+      <w:r>
+        <w:rPr>
+          <w:rFonts w:ascii="Consolas" w:hAnsi="Consolas" w:eastAsia="Consolas" w:cs="Consolas"/>
+          <w:sz w:val="15"/>
+          <w:noProof/>
+        </w:rPr>
+        <w:t>CLASS_SEGMENTS = {'Proteins': [('Proteins', '#7030A0')],</w:t>
+      </w:r>
+    </w:p>
+    <w:p>
+      <w:pPr>
+        <w:spacing w:before="0" w:after="0" w:line="240" w:lineRule="auto"/>
+      </w:pPr>
+      <w:r>
+        <w:rPr>
+          <w:rFonts w:ascii="Consolas" w:hAnsi="Consolas" w:eastAsia="Consolas" w:cs="Consolas"/>
+          <w:sz w:val="15"/>
+          <w:noProof/>
+        </w:rPr>
+        <w:t xml:space="preserve">                  'Nucleic Acids': [('Nucleic Acids', '#1F3864')],</w:t>
+      </w:r>
+    </w:p>
+    <w:p>
+      <w:pPr>
+        <w:spacing w:before="0" w:after="0" w:line="240" w:lineRule="auto"/>
+      </w:pPr>
+      <w:r>
+        <w:rPr>
+          <w:rFonts w:ascii="Consolas" w:hAnsi="Consolas" w:eastAsia="Consolas" w:cs="Consolas"/>
+          <w:sz w:val="15"/>
+          <w:noProof/>
+        </w:rPr>
+        <w:t xml:space="preserve">                  'Lipids/NA': [('Lipids/', '#2E75B6'), ('NA', 'k')]}</w:t>
       </w:r>
     </w:p>
     <w:p>
@@ -1495,7 +1534,7 @@
           <w:sz w:val="15"/>
           <w:noProof/>
         </w:rPr>
-        <w:t>def two_colour_label(ax, xpos, ybase, num, cls, ha, weak):</w:t>
+        <w:t>def segment_label(ax, xpos, ybase, segments, ha):</w:t>
       </w:r>
     </w:p>
     <w:p>
@@ -1508,7 +1547,7 @@
           <w:sz w:val="15"/>
           <w:noProof/>
         </w:rPr>
-        <w:t xml:space="preserve">    """Vertical label: wavenumber in black, then '-Class' in the class colour."""</w:t>
+        <w:t xml:space="preserve">    """Vertical label made of coloured text segments stacked upwards."""</w:t>
       </w:r>
     </w:p>
     <w:p>
@@ -1521,85 +1560,7 @@
           <w:sz w:val="15"/>
           <w:noProof/>
         </w:rPr>
-        <w:t xml:space="preserve">    style = 'italic' if weak else 'normal'</w:t>
-      </w:r>
-    </w:p>
-    <w:p>
-      <w:pPr>
-        <w:spacing w:before="0" w:after="0" w:line="240" w:lineRule="auto"/>
-      </w:pPr>
-      <w:r>
-        <w:rPr>
-          <w:rFonts w:ascii="Consolas" w:hAnsi="Consolas" w:eastAsia="Consolas" w:cs="Consolas"/>
-          <w:sz w:val="15"/>
-          <w:noProof/>
-        </w:rPr>
-        <w:t xml:space="preserve">    t = ax.text(xpos, ybase, num, rotation=90, va='bottom', ha=ha, fontsize=10,</w:t>
-      </w:r>
-    </w:p>
-    <w:p>
-      <w:pPr>
-        <w:spacing w:before="0" w:after="0" w:line="240" w:lineRule="auto"/>
-      </w:pPr>
-      <w:r>
-        <w:rPr>
-          <w:rFonts w:ascii="Consolas" w:hAnsi="Consolas" w:eastAsia="Consolas" w:cs="Consolas"/>
-          <w:sz w:val="15"/>
-          <w:noProof/>
-        </w:rPr>
-        <w:t xml:space="preserve">                color='k', style=style)</w:t>
-      </w:r>
-    </w:p>
-    <w:p>
-      <w:pPr>
-        <w:spacing w:before="0" w:after="0" w:line="240" w:lineRule="auto"/>
-      </w:pPr>
-      <w:r>
-        <w:rPr>
-          <w:rFonts w:ascii="Consolas" w:hAnsi="Consolas" w:eastAsia="Consolas" w:cs="Consolas"/>
-          <w:sz w:val="15"/>
-          <w:noProof/>
-        </w:rPr>
-        <w:t xml:space="preserve">    if cls == 'Si':</w:t>
-      </w:r>
-    </w:p>
-    <w:p>
-      <w:pPr>
-        <w:spacing w:before="0" w:after="0" w:line="240" w:lineRule="auto"/>
-      </w:pPr>
-      <w:r>
-        <w:rPr>
-          <w:rFonts w:ascii="Consolas" w:hAnsi="Consolas" w:eastAsia="Consolas" w:cs="Consolas"/>
-          <w:sz w:val="15"/>
-          <w:noProof/>
-        </w:rPr>
-        <w:t xml:space="preserve">        return</w:t>
-      </w:r>
-    </w:p>
-    <w:p>
-      <w:pPr>
-        <w:spacing w:before="0" w:after="0" w:line="240" w:lineRule="auto"/>
-      </w:pPr>
-      <w:r>
-        <w:rPr>
-          <w:rFonts w:ascii="Consolas" w:hAnsi="Consolas" w:eastAsia="Consolas" w:cs="Consolas"/>
-          <w:sz w:val="15"/>
-          <w:noProof/>
-        </w:rPr>
-        <w:t xml:space="preserve">    ax.figure.canvas.draw()</w:t>
-      </w:r>
-    </w:p>
-    <w:p>
-      <w:pPr>
-        <w:spacing w:before="0" w:after="0" w:line="240" w:lineRule="auto"/>
-      </w:pPr>
-      <w:r>
-        <w:rPr>
-          <w:rFonts w:ascii="Consolas" w:hAnsi="Consolas" w:eastAsia="Consolas" w:cs="Consolas"/>
-          <w:sz w:val="15"/>
-          <w:noProof/>
-        </w:rPr>
-        <w:t xml:space="preserve">    bb = t.get_window_extent().transformed(ax.transData.inverted())</w:t>
+        <w:t xml:space="preserve">    y = ybase</w:t>
       </w:r>
     </w:p>
     <w:p>
@@ -1625,7 +1586,7 @@
           <w:sz w:val="15"/>
           <w:noProof/>
         </w:rPr>
-        <w:t xml:space="preserve">    ax.text(xpos, bb.y1 - gap, f'-{cls}', rotation=90, va='bottom', ha=ha, fontsize=10,</w:t>
+        <w:t xml:space="preserve">    for i, (txt, col) in enumerate(segments):</w:t>
       </w:r>
     </w:p>
     <w:p>
@@ -1638,7 +1599,33 @@
           <w:sz w:val="15"/>
           <w:noProof/>
         </w:rPr>
-        <w:t xml:space="preserve">            color=CLASS_COL[cls], style=style)</w:t>
+        <w:t xml:space="preserve">        t = ax.text(xpos, y, txt, rotation=90, va='bottom', ha=ha, fontsize=11, color=col)</w:t>
+      </w:r>
+    </w:p>
+    <w:p>
+      <w:pPr>
+        <w:spacing w:before="0" w:after="0" w:line="240" w:lineRule="auto"/>
+      </w:pPr>
+      <w:r>
+        <w:rPr>
+          <w:rFonts w:ascii="Consolas" w:hAnsi="Consolas" w:eastAsia="Consolas" w:cs="Consolas"/>
+          <w:sz w:val="15"/>
+          <w:noProof/>
+        </w:rPr>
+        <w:t xml:space="preserve">        ax.figure.canvas.draw()</w:t>
+      </w:r>
+    </w:p>
+    <w:p>
+      <w:pPr>
+        <w:spacing w:before="0" w:after="0" w:line="240" w:lineRule="auto"/>
+      </w:pPr>
+      <w:r>
+        <w:rPr>
+          <w:rFonts w:ascii="Consolas" w:hAnsi="Consolas" w:eastAsia="Consolas" w:cs="Consolas"/>
+          <w:sz w:val="15"/>
+          <w:noProof/>
+        </w:rPr>
+        <w:t xml:space="preserve">        y = t.get_window_extent().transformed(ax.transData.inverted()).y1 - gap</w:t>
       </w:r>
     </w:p>
     <w:p>
@@ -1844,7 +1831,7 @@
           <w:sz w:val="15"/>
           <w:noProof/>
         </w:rPr>
-        <w:t xml:space="preserve">        txt = f'{"~" if weak else ""}{pos:.0f}{" sh" if sh else ""}'</w:t>
+        <w:t xml:space="preserve">        txt = f'{pos:.1f}' if cls == 'Si' else f'{pos:.0f}'</w:t>
       </w:r>
     </w:p>
     <w:p>
@@ -1909,7 +1896,7 @@
           <w:sz w:val="15"/>
           <w:noProof/>
         </w:rPr>
-        <w:t xml:space="preserve">            txt = f'{pair[1]}/{txt}'</w:t>
+        <w:t xml:space="preserve">            txt = f'{pair[1]}/{txt[-2:]}'           # e.g. 825/52, written as in the original</w:t>
       </w:r>
     </w:p>
     <w:p>
@@ -1961,7 +1948,7 @@
           <w:sz w:val="15"/>
           <w:noProof/>
         </w:rPr>
-        <w:t xml:space="preserve">        labels.append((pos + dx, top + 8, txt, cls,</w:t>
+        <w:t xml:space="preserve">        segs = [(txt, 'k')]</w:t>
       </w:r>
     </w:p>
     <w:p>
@@ -1974,7 +1961,46 @@
           <w:sz w:val="15"/>
           <w:noProof/>
         </w:rPr>
-        <w:t xml:space="preserve">                       {'up': 'center', 'up-left': 'right', 'up-right': 'left'}[where], weak))</w:t>
+        <w:t xml:space="preserve">        if cls not in (None, 'Si'):</w:t>
+      </w:r>
+    </w:p>
+    <w:p>
+      <w:pPr>
+        <w:spacing w:before="0" w:after="0" w:line="240" w:lineRule="auto"/>
+      </w:pPr>
+      <w:r>
+        <w:rPr>
+          <w:rFonts w:ascii="Consolas" w:hAnsi="Consolas" w:eastAsia="Consolas" w:cs="Consolas"/>
+          <w:sz w:val="15"/>
+          <w:noProof/>
+        </w:rPr>
+        <w:t xml:space="preserve">            segs = [(txt + '- ', 'k')] + CLASS_SEGMENTS[cls]</w:t>
+      </w:r>
+    </w:p>
+    <w:p>
+      <w:pPr>
+        <w:spacing w:before="0" w:after="0" w:line="240" w:lineRule="auto"/>
+      </w:pPr>
+      <w:r>
+        <w:rPr>
+          <w:rFonts w:ascii="Consolas" w:hAnsi="Consolas" w:eastAsia="Consolas" w:cs="Consolas"/>
+          <w:sz w:val="15"/>
+          <w:noProof/>
+        </w:rPr>
+        <w:t xml:space="preserve">        labels.append((pos + dx, top + 8, segs,</w:t>
+      </w:r>
+    </w:p>
+    <w:p>
+      <w:pPr>
+        <w:spacing w:before="0" w:after="0" w:line="240" w:lineRule="auto"/>
+      </w:pPr>
+      <w:r>
+        <w:rPr>
+          <w:rFonts w:ascii="Consolas" w:hAnsi="Consolas" w:eastAsia="Consolas" w:cs="Consolas"/>
+          <w:sz w:val="15"/>
+          <w:noProof/>
+        </w:rPr>
+        <w:t xml:space="preserve">                       {'up': 'center', 'up-left': 'right', 'up-right': 'left'}[where]))</w:t>
       </w:r>
     </w:p>
     <w:p>
@@ -2103,7 +2129,7 @@
           <w:sz w:val="15"/>
           <w:noProof/>
         </w:rPr>
-        <w:t xml:space="preserve">    two_colour_label(ax, *lab)</w:t>
+        <w:t xml:space="preserve">    segment_label(ax, *lab)</w:t>
       </w:r>
     </w:p>
     <w:p>
@@ -2116,7 +2142,59 @@
           <w:sz w:val="15"/>
           <w:noProof/>
         </w:rPr>
-        <w:t>ax.set_yticks([])</w:t>
+        <w:t>for s_, xg, word in GROUP_LABELS:</w:t>
+      </w:r>
+    </w:p>
+    <w:p>
+      <w:pPr>
+        <w:spacing w:before="0" w:after="0" w:line="240" w:lineRule="auto"/>
+      </w:pPr>
+      <w:r>
+        <w:rPr>
+          <w:rFonts w:ascii="Consolas" w:hAnsi="Consolas" w:eastAsia="Consolas" w:cs="Consolas"/>
+          <w:sz w:val="15"/>
+          <w:noProof/>
+        </w:rPr>
+        <w:t xml:space="preserve">    x, y = spectra[s_]</w:t>
+      </w:r>
+    </w:p>
+    <w:p>
+      <w:pPr>
+        <w:spacing w:before="0" w:after="0" w:line="240" w:lineRule="auto"/>
+      </w:pPr>
+      <w:r>
+        <w:rPr>
+          <w:rFonts w:ascii="Consolas" w:hAnsi="Consolas" w:eastAsia="Consolas" w:cs="Consolas"/>
+          <w:sz w:val="15"/>
+          <w:noProof/>
+        </w:rPr>
+        <w:t xml:space="preserve">    off = OFFSET if s_ == 'NV' else 0</w:t>
+      </w:r>
+    </w:p>
+    <w:p>
+      <w:pPr>
+        <w:spacing w:before="0" w:after="0" w:line="240" w:lineRule="auto"/>
+      </w:pPr>
+      <w:r>
+        <w:rPr>
+          <w:rFonts w:ascii="Consolas" w:hAnsi="Consolas" w:eastAsia="Consolas" w:cs="Consolas"/>
+          <w:sz w:val="15"/>
+          <w:noProof/>
+        </w:rPr>
+        <w:t xml:space="preserve">    segment_label(ax, xg, y[np.abs(x - xg) &lt;= 60].max() + off + 8, CLASS_SEGMENTS[word], 'center')</w:t>
+      </w:r>
+    </w:p>
+    <w:p>
+      <w:pPr>
+        <w:spacing w:before="0" w:after="0" w:line="240" w:lineRule="auto"/>
+      </w:pPr>
+      <w:r>
+        <w:rPr>
+          <w:rFonts w:ascii="Consolas" w:hAnsi="Consolas" w:eastAsia="Consolas" w:cs="Consolas"/>
+          <w:sz w:val="15"/>
+          <w:noProof/>
+        </w:rPr>
+        <w:t>ax.tick_params(axis='y', direction='in', length=5, labelleft=False)</w:t>
       </w:r>
     </w:p>
     <w:p>
@@ -2181,7 +2259,7 @@
           <w:sz w:val="15"/>
           <w:noProof/>
         </w:rPr>
-        <w:t xml:space="preserve">        ha='right', va='bottom', color=C_NV, fontsize=12)</w:t>
+        <w:t xml:space="preserve">        ha='right', va='bottom', color=C_NV, fontsize=11)</w:t>
       </w:r>
     </w:p>
     <w:p>
@@ -2194,7 +2272,7 @@
           <w:sz w:val="15"/>
           <w:noProof/>
         </w:rPr>
-        <w:t>ax.text(0.01, 0.20, 'EV Acacia on Ag/SiNWs', transform=ax.transAxes,</w:t>
+        <w:t>ax.text(0.006, 0.20, 'EV Acacia on Ag/SiNWs', transform=ax.transAxes,</w:t>
       </w:r>
     </w:p>
     <w:p>
@@ -2207,46 +2285,7 @@
           <w:sz w:val="15"/>
           <w:noProof/>
         </w:rPr>
-        <w:t xml:space="preserve">        ha='left', va='bottom', color=C_EV, fontsize=12)</w:t>
-      </w:r>
-    </w:p>
-    <w:p>
-      <w:pPr>
-        <w:spacing w:before="0" w:after="0" w:line="240" w:lineRule="auto"/>
-      </w:pPr>
-      <w:r>
-        <w:rPr>
-          <w:rFonts w:ascii="Consolas" w:hAnsi="Consolas" w:eastAsia="Consolas" w:cs="Consolas"/>
-          <w:sz w:val="15"/>
-          <w:noProof/>
-        </w:rPr>
-        <w:t>ax.text(0.01, 0.60, f'~ weak band (&lt; {SNR_MIN} x noise), tentative;  sh = shoulder',</w:t>
-      </w:r>
-    </w:p>
-    <w:p>
-      <w:pPr>
-        <w:spacing w:before="0" w:after="0" w:line="240" w:lineRule="auto"/>
-      </w:pPr>
-      <w:r>
-        <w:rPr>
-          <w:rFonts w:ascii="Consolas" w:hAnsi="Consolas" w:eastAsia="Consolas" w:cs="Consolas"/>
-          <w:sz w:val="15"/>
-          <w:noProof/>
-        </w:rPr>
-        <w:t xml:space="preserve">        transform=ax.transAxes, ha='left', va='top', fontsize=9, style='italic',</w:t>
-      </w:r>
-    </w:p>
-    <w:p>
-      <w:pPr>
-        <w:spacing w:before="0" w:after="0" w:line="240" w:lineRule="auto"/>
-      </w:pPr>
-      <w:r>
-        <w:rPr>
-          <w:rFonts w:ascii="Consolas" w:hAnsi="Consolas" w:eastAsia="Consolas" w:cs="Consolas"/>
-          <w:sz w:val="15"/>
-          <w:noProof/>
-        </w:rPr>
-        <w:t xml:space="preserve">        bbox=dict(fc='white', ec='none', pad=1), zorder=5)</w:t>
+        <w:t xml:space="preserve">        ha='left', va='bottom', color=C_EV, fontsize=11)</w:t>
       </w:r>
     </w:p>
     <w:p>

</xml_diff>

<commit_message>
Comparison script: remove noise/SNR calculation; report peak positions only
Co-Authored-By: Claude Opus 5.5 <noreply@anthropic.com>
Claude-Session: https://claude.ai/code/session_01L8hQ8e5u5KmaH4dD9snyRw
</commit_message>
<xml_diff>
--- a/EV_NV_Spectra_Comparison_Code.docx
+++ b/EV_NV_Spectra_Comparison_Code.docx
@@ -208,7 +208,7 @@
           <w:sz w:val="15"/>
           <w:noProof/>
         </w:rPr>
-        <w:t># Every peak label is measured from the data: the maximum of the lightly</w:t>
+        <w:t># Every peak label is the position of the local maximum of the spectrum within</w:t>
       </w:r>
     </w:p>
     <w:p>
@@ -221,7 +221,7 @@
           <w:sz w:val="15"/>
           <w:noProof/>
         </w:rPr>
-        <w:t># smoothed spectrum (Savitzky-Golay 11 pts, 3rd order; used ONLY to locate the</w:t>
+        <w:t># +/-12 cm-1 of the nominal band (found on a lightly smoothed copy, Savitzky-Golay</w:t>
       </w:r>
     </w:p>
     <w:p>
@@ -234,7 +234,7 @@
           <w:sz w:val="15"/>
           <w:noProof/>
         </w:rPr>
-        <w:t># maximum) after removing a straight local background over +/-30 cm-1.</w:t>
+        <w:t># 11 pts, 3rd order, used ONLY to locate the maximum; the plotted data are raw).</w:t>
       </w:r>
     </w:p>
     <w:p>
@@ -247,7 +247,7 @@
           <w:sz w:val="15"/>
           <w:noProof/>
         </w:rPr>
-        <w:t># Labels follow the layout of the user's original figure. Bands rising less than</w:t>
+        <w:t># Labels follow the layout of the user's original figure. The measured positions</w:t>
       </w:r>
     </w:p>
     <w:p>
@@ -260,20 +260,7 @@
           <w:sz w:val="15"/>
           <w:noProof/>
         </w:rPr>
-        <w:t># 2.5 x the noise are flagged as weak in EV_NV_Comparison_peaks.csv (all measured</w:t>
-      </w:r>
-    </w:p>
-    <w:p>
-      <w:pPr>
-        <w:spacing w:before="0" w:after="0" w:line="240" w:lineRule="auto"/>
-      </w:pPr>
-      <w:r>
-        <w:rPr>
-          <w:rFonts w:ascii="Consolas" w:hAnsi="Consolas" w:eastAsia="Consolas" w:cs="Consolas"/>
-          <w:sz w:val="15"/>
-          <w:noProof/>
-        </w:rPr>
-        <w:t># values are written there).</w:t>
+        <w:t># are written to EV_NV_Comparison_peaks.csv.</w:t>
       </w:r>
     </w:p>
     <w:p>
@@ -607,19 +594,6 @@
           <w:sz w:val="15"/>
           <w:noProof/>
         </w:rPr>
-        <w:t>SNR_MIN = 2.5           # below this peak height / noise a band is flagged 'weak' in the CSV</w:t>
-      </w:r>
-    </w:p>
-    <w:p>
-      <w:pPr>
-        <w:spacing w:before="0" w:after="0" w:line="240" w:lineRule="auto"/>
-      </w:pPr>
-      <w:r>
-        <w:rPr>
-          <w:rFonts w:ascii="Consolas" w:hAnsi="Consolas" w:eastAsia="Consolas" w:cs="Consolas"/>
-          <w:sz w:val="15"/>
-          <w:noProof/>
-        </w:rPr>
         <w:t>BOXES = [(775, 890), (1195, 1320), (1515, 1690)]   # dashed comparison regions</w:t>
       </w:r>
     </w:p>
@@ -1212,7 +1186,7 @@
           <w:sz w:val="15"/>
           <w:noProof/>
         </w:rPr>
-        <w:t>def measure(x, y, nominal, noise, shoulder=False):</w:t>
+        <w:t>def measure(x, y, nominal):</w:t>
       </w:r>
     </w:p>
     <w:p>
@@ -1225,7 +1199,7 @@
           <w:sz w:val="15"/>
           <w:noProof/>
         </w:rPr>
-        <w:t xml:space="preserve">    """Measured peak position, height above local line and SNR.</w:t>
+        <w:t xml:space="preserve">    """Peak position: most prominent local maximum of the smoothed spectrum within</w:t>
       </w:r>
     </w:p>
     <w:p>
@@ -1238,59 +1212,7 @@
           <w:sz w:val="15"/>
           <w:noProof/>
         </w:rPr>
-        <w:t xml:space="preserve">    Position = most prominent local maximum of the smoothed spectrum within</w:t>
-      </w:r>
-    </w:p>
-    <w:p>
-      <w:pPr>
-        <w:spacing w:before="0" w:after="0" w:line="240" w:lineRule="auto"/>
-      </w:pPr>
-      <w:r>
-        <w:rPr>
-          <w:rFonts w:ascii="Consolas" w:hAnsi="Consolas" w:eastAsia="Consolas" w:cs="Consolas"/>
-          <w:sz w:val="15"/>
-          <w:noProof/>
-        </w:rPr>
-        <w:t xml:space="preserve">    +/-12 cm-1 of the nominal value (works for peaks and shoulders on a slope).</w:t>
-      </w:r>
-    </w:p>
-    <w:p>
-      <w:pPr>
-        <w:spacing w:before="0" w:after="0" w:line="240" w:lineRule="auto"/>
-      </w:pPr>
-      <w:r>
-        <w:rPr>
-          <w:rFonts w:ascii="Consolas" w:hAnsi="Consolas" w:eastAsia="Consolas" w:cs="Consolas"/>
-          <w:sz w:val="15"/>
-          <w:noProof/>
-        </w:rPr>
-        <w:t xml:space="preserve">    Height = smoothed value at that position minus a straight local background</w:t>
-      </w:r>
-    </w:p>
-    <w:p>
-      <w:pPr>
-        <w:spacing w:before="0" w:after="0" w:line="240" w:lineRule="auto"/>
-      </w:pPr>
-      <w:r>
-        <w:rPr>
-          <w:rFonts w:ascii="Consolas" w:hAnsi="Consolas" w:eastAsia="Consolas" w:cs="Consolas"/>
-          <w:sz w:val="15"/>
-          <w:noProof/>
-        </w:rPr>
-        <w:t xml:space="preserve">    drawn between the spectrum at -30 and +30 cm-1; for a shoulder (on the flank</w:t>
-      </w:r>
-    </w:p>
-    <w:p>
-      <w:pPr>
-        <w:spacing w:before="0" w:after="0" w:line="240" w:lineRule="auto"/>
-      </w:pPr>
-      <w:r>
-        <w:rPr>
-          <w:rFonts w:ascii="Consolas" w:hAnsi="Consolas" w:eastAsia="Consolas" w:cs="Consolas"/>
-          <w:sz w:val="15"/>
-          <w:noProof/>
-        </w:rPr>
-        <w:t xml:space="preserve">    of a larger band) the prominence of the local maximum is used instead."""</w:t>
+        <w:t xml:space="preserve">    +/-12 cm-1 of the nominal value (works for peaks and shoulders)."""</w:t>
       </w:r>
     </w:p>
     <w:p>
@@ -1394,72 +1316,7 @@
           <w:sz w:val="15"/>
           <w:noProof/>
         </w:rPr>
-        <w:t xml:space="preserve">    w = np.abs(x - x[i]) &lt;= 30</w:t>
-      </w:r>
-    </w:p>
-    <w:p>
-      <w:pPr>
-        <w:spacing w:before="0" w:after="0" w:line="240" w:lineRule="auto"/>
-      </w:pPr>
-      <w:r>
-        <w:rPr>
-          <w:rFonts w:ascii="Consolas" w:hAnsi="Consolas" w:eastAsia="Consolas" w:cs="Consolas"/>
-          <w:sz w:val="15"/>
-          <w:noProof/>
-        </w:rPr>
-        <w:t xml:space="preserve">    xw, yw = x[w], ys[w]</w:t>
-      </w:r>
-    </w:p>
-    <w:p>
-      <w:pPr>
-        <w:spacing w:before="0" w:after="0" w:line="240" w:lineRule="auto"/>
-      </w:pPr>
-      <w:r>
-        <w:rPr>
-          <w:rFonts w:ascii="Consolas" w:hAnsi="Consolas" w:eastAsia="Consolas" w:cs="Consolas"/>
-          <w:sz w:val="15"/>
-          <w:noProof/>
-        </w:rPr>
-        <w:t xml:space="preserve">    h = ys[i] - np.interp(x[i], [xw[0], xw[-1]], [yw[:6].mean(), yw[-6:].mean()])</w:t>
-      </w:r>
-    </w:p>
-    <w:p>
-      <w:pPr>
-        <w:spacing w:before="0" w:after="0" w:line="240" w:lineRule="auto"/>
-      </w:pPr>
-      <w:r>
-        <w:rPr>
-          <w:rFonts w:ascii="Consolas" w:hAnsi="Consolas" w:eastAsia="Consolas" w:cs="Consolas"/>
-          <w:sz w:val="15"/>
-          <w:noProof/>
-        </w:rPr>
-        <w:t xml:space="preserve">    if shoulder:      # on the flank of a larger band: use the prominence of the local maximum</w:t>
-      </w:r>
-    </w:p>
-    <w:p>
-      <w:pPr>
-        <w:spacing w:before="0" w:after="0" w:line="240" w:lineRule="auto"/>
-      </w:pPr>
-      <w:r>
-        <w:rPr>
-          <w:rFonts w:ascii="Consolas" w:hAnsi="Consolas" w:eastAsia="Consolas" w:cs="Consolas"/>
-          <w:sz w:val="15"/>
-          <w:noProof/>
-        </w:rPr>
-        <w:t xml:space="preserve">        h = float(pr['prominences'].max()) if len(pk) else 0.0</w:t>
-      </w:r>
-    </w:p>
-    <w:p>
-      <w:pPr>
-        <w:spacing w:before="0" w:after="0" w:line="240" w:lineRule="auto"/>
-      </w:pPr>
-      <w:r>
-        <w:rPr>
-          <w:rFonts w:ascii="Consolas" w:hAnsi="Consolas" w:eastAsia="Consolas" w:cs="Consolas"/>
-          <w:sz w:val="15"/>
-          <w:noProof/>
-        </w:rPr>
-        <w:t xml:space="preserve">    return float(x[i]), float(h), float(h / noise)</w:t>
+        <w:t xml:space="preserve">    return float(x[i])</w:t>
       </w:r>
     </w:p>
     <w:p>
@@ -1509,19 +1366,6 @@
           <w:sz w:val="15"/>
           <w:noProof/>
         </w:rPr>
-        <w:t>noise = {s: np.std(np.diff(y)) / np.sqrt(2) for s, (x, y) in spectra.items()}</w:t>
-      </w:r>
-    </w:p>
-    <w:p>
-      <w:pPr>
-        <w:spacing w:before="0" w:after="0" w:line="240" w:lineRule="auto"/>
-      </w:pPr>
-      <w:r>
-        <w:rPr>
-          <w:rFonts w:ascii="Consolas" w:hAnsi="Consolas" w:eastAsia="Consolas" w:cs="Consolas"/>
-          <w:sz w:val="15"/>
-          <w:noProof/>
-        </w:rPr>
       </w:r>
     </w:p>
     <w:p>
@@ -1753,7 +1597,7 @@
           <w:sz w:val="15"/>
           <w:noProof/>
         </w:rPr>
-        <w:t xml:space="preserve">        sh = '(shoulder)' in assign</w:t>
+        <w:t xml:space="preserve">        pos = measure(x, y, nominal)</w:t>
       </w:r>
     </w:p>
     <w:p>
@@ -1766,46 +1610,7 @@
           <w:sz w:val="15"/>
           <w:noProof/>
         </w:rPr>
-        <w:t xml:space="preserve">        pos, h, snr = measure(x, y, nominal, noise[s], shoulder=sh)</w:t>
-      </w:r>
-    </w:p>
-    <w:p>
-      <w:pPr>
-        <w:spacing w:before="0" w:after="0" w:line="240" w:lineRule="auto"/>
-      </w:pPr>
-      <w:r>
-        <w:rPr>
-          <w:rFonts w:ascii="Consolas" w:hAnsi="Consolas" w:eastAsia="Consolas" w:cs="Consolas"/>
-          <w:sz w:val="15"/>
-          <w:noProof/>
-        </w:rPr>
-        <w:t xml:space="preserve">        weak = snr &lt; SNR_MIN</w:t>
-      </w:r>
-    </w:p>
-    <w:p>
-      <w:pPr>
-        <w:spacing w:before="0" w:after="0" w:line="240" w:lineRule="auto"/>
-      </w:pPr>
-      <w:r>
-        <w:rPr>
-          <w:rFonts w:ascii="Consolas" w:hAnsi="Consolas" w:eastAsia="Consolas" w:cs="Consolas"/>
-          <w:sz w:val="15"/>
-          <w:noProof/>
-        </w:rPr>
-        <w:t xml:space="preserve">        rows.append([s, nominal, round(pos, 1), round(h, 1), round(snr, 1), cls, assign,</w:t>
-      </w:r>
-    </w:p>
-    <w:p>
-      <w:pPr>
-        <w:spacing w:before="0" w:after="0" w:line="240" w:lineRule="auto"/>
-      </w:pPr>
-      <w:r>
-        <w:rPr>
-          <w:rFonts w:ascii="Consolas" w:hAnsi="Consolas" w:eastAsia="Consolas" w:cs="Consolas"/>
-          <w:sz w:val="15"/>
-          <w:noProof/>
-        </w:rPr>
-        <w:t xml:space="preserve">                     'weak - tentative (~)' if weak else 'yes'])</w:t>
+        <w:t xml:space="preserve">        rows.append([s, nominal, round(pos, 1), cls, assign])</w:t>
       </w:r>
     </w:p>
     <w:p>
@@ -1857,7 +1662,7 @@
           <w:sz w:val="15"/>
           <w:noProof/>
         </w:rPr>
-        <w:t xml:space="preserve">            pair = (pos, txt, top, weak)</w:t>
+        <w:t xml:space="preserve">            pair = (pos, txt, top)</w:t>
       </w:r>
     </w:p>
     <w:p>
@@ -1909,7 +1714,7 @@
           <w:sz w:val="15"/>
           <w:noProof/>
         </w:rPr>
-        <w:t xml:space="preserve">            pos, top, weak, where = (pair[0] + pos) / 2, max(pair[2], top), pair[3] or weak, 'up'</w:t>
+        <w:t xml:space="preserve">            pos, top, where = (pair[0] + pos) / 2, max(pair[2], top), 'up'</w:t>
       </w:r>
     </w:p>
     <w:p>
@@ -2375,20 +2180,7 @@
           <w:sz w:val="15"/>
           <w:noProof/>
         </w:rPr>
-        <w:t xml:space="preserve">    w.writerow(['Spectrum', 'Nominal (cm-1)', 'Measured (cm-1)', 'Height above local line (counts)',</w:t>
-      </w:r>
-    </w:p>
-    <w:p>
-      <w:pPr>
-        <w:spacing w:before="0" w:after="0" w:line="240" w:lineRule="auto"/>
-      </w:pPr>
-      <w:r>
-        <w:rPr>
-          <w:rFonts w:ascii="Consolas" w:hAnsi="Consolas" w:eastAsia="Consolas" w:cs="Consolas"/>
-          <w:sz w:val="15"/>
-          <w:noProof/>
-        </w:rPr>
-        <w:t xml:space="preserve">                'Height / noise', 'Class', 'Assignment', 'Labelled'])</w:t>
+        <w:t xml:space="preserve">    w.writerow(['Spectrum', 'Nominal (cm-1)', 'Measured (cm-1)', 'Class', 'Assignment'])</w:t>
       </w:r>
     </w:p>
     <w:p>
@@ -2402,19 +2194,6 @@
           <w:noProof/>
         </w:rPr>
         <w:t xml:space="preserve">    w.writerows(rows)</w:t>
-      </w:r>
-    </w:p>
-    <w:p>
-      <w:pPr>
-        <w:spacing w:before="0" w:after="0" w:line="240" w:lineRule="auto"/>
-      </w:pPr>
-      <w:r>
-        <w:rPr>
-          <w:rFonts w:ascii="Consolas" w:hAnsi="Consolas" w:eastAsia="Consolas" w:cs="Consolas"/>
-          <w:sz w:val="15"/>
-          <w:noProof/>
-        </w:rPr>
-        <w:t>print(f'noise: EV {noise["EV"]:.1f}, NV {noise["NV"]:.1f} counts')</w:t>
       </w:r>
     </w:p>
     <w:p>

</xml_diff>

<commit_message>
Comparison figure for EV Acacia S2 vs NV Acacia s4a (same BC200 settings)
Co-Authored-By: Claude Opus 5.5 <noreply@anthropic.com>
Claude-Session: https://claude.ai/code/session_01L8hQ8e5u5KmaH4dD9snyRw
</commit_message>
<xml_diff>
--- a/EV_NV_Spectra_Comparison_Code.docx
+++ b/EV_NV_Spectra_Comparison_Code.docx
@@ -543,7 +543,33 @@
           <w:sz w:val="15"/>
           <w:noProof/>
         </w:rPr>
-        <w:t>OUT = 'EV_NV_Comparison'</w:t>
+        <w:t># which EV spectrum is used (S1 or S2), read from the EV file name</w:t>
+      </w:r>
+    </w:p>
+    <w:p>
+      <w:pPr>
+        <w:spacing w:before="0" w:after="0" w:line="240" w:lineRule="auto"/>
+      </w:pPr>
+      <w:r>
+        <w:rPr>
+          <w:rFonts w:ascii="Consolas" w:hAnsi="Consolas" w:eastAsia="Consolas" w:cs="Consolas"/>
+          <w:sz w:val="15"/>
+          <w:noProof/>
+        </w:rPr>
+        <w:t>EV_TAG = 'S2' if Path(EV_FILE).name.startswith('S2') else 'S1'</w:t>
+      </w:r>
+    </w:p>
+    <w:p>
+      <w:pPr>
+        <w:spacing w:before="0" w:after="0" w:line="240" w:lineRule="auto"/>
+      </w:pPr>
+      <w:r>
+        <w:rPr>
+          <w:rFonts w:ascii="Consolas" w:hAnsi="Consolas" w:eastAsia="Consolas" w:cs="Consolas"/>
+          <w:sz w:val="15"/>
+          <w:noProof/>
+        </w:rPr>
+        <w:t>OUT = 'EV_NV_Comparison' if EV_TAG == 'S1' else f'EV_NV_Comparison_{EV_TAG}'</w:t>
       </w:r>
     </w:p>
     <w:p>
@@ -581,7 +607,20 @@
           <w:sz w:val="15"/>
           <w:noProof/>
         </w:rPr>
-        <w:t>OFFSET = 560            # counts added to the NV spectrum (display only)</w:t>
+        <w:t># counts added to the NV spectrum (display only); None = just enough to separate</w:t>
+      </w:r>
+    </w:p>
+    <w:p>
+      <w:pPr>
+        <w:spacing w:before="0" w:after="0" w:line="240" w:lineRule="auto"/>
+      </w:pPr>
+      <w:r>
+        <w:rPr>
+          <w:rFonts w:ascii="Consolas" w:hAnsi="Consolas" w:eastAsia="Consolas" w:cs="Consolas"/>
+          <w:sz w:val="15"/>
+          <w:noProof/>
+        </w:rPr>
+        <w:t>OFFSET = {'S1': 560, 'S2': None}[EV_TAG]</w:t>
       </w:r>
     </w:p>
     <w:p>
@@ -827,7 +866,7 @@
           <w:sz w:val="15"/>
           <w:noProof/>
         </w:rPr>
-        <w:t xml:space="preserve">    'EV': [</w:t>
+        <w:t xml:space="preserve">    'EV_S1': [</w:t>
       </w:r>
     </w:p>
     <w:p>
@@ -931,7 +970,163 @@
           <w:sz w:val="15"/>
           <w:noProof/>
         </w:rPr>
+        <w:t xml:space="preserve">    'EV_S2': [</w:t>
+      </w:r>
+    </w:p>
+    <w:p>
+      <w:pPr>
+        <w:spacing w:before="0" w:after="0" w:line="240" w:lineRule="auto"/>
+      </w:pPr>
+      <w:r>
+        <w:rPr>
+          <w:rFonts w:ascii="Consolas" w:hAnsi="Consolas" w:eastAsia="Consolas" w:cs="Consolas"/>
+          <w:sz w:val="15"/>
+          <w:noProof/>
+        </w:rPr>
+        <w:t xml:space="preserve">        (519, 'Si', 'Si substrate (crystalline silicon phonon)', 'up'),</w:t>
+      </w:r>
+    </w:p>
+    <w:p>
+      <w:pPr>
+        <w:spacing w:before="0" w:after="0" w:line="240" w:lineRule="auto"/>
+      </w:pPr>
+      <w:r>
+        <w:rPr>
+          <w:rFonts w:ascii="Consolas" w:hAnsi="Consolas" w:eastAsia="Consolas" w:cs="Consolas"/>
+          <w:sz w:val="15"/>
+          <w:noProof/>
+        </w:rPr>
+        <w:t xml:space="preserve">        (836, 'Proteins', 'Tyr Fermi doublet', 'up'),</w:t>
+      </w:r>
+    </w:p>
+    <w:p>
+      <w:pPr>
+        <w:spacing w:before="0" w:after="0" w:line="240" w:lineRule="auto"/>
+      </w:pPr>
+      <w:r>
+        <w:rPr>
+          <w:rFonts w:ascii="Consolas" w:hAnsi="Consolas" w:eastAsia="Consolas" w:cs="Consolas"/>
+          <w:sz w:val="15"/>
+          <w:noProof/>
+        </w:rPr>
+        <w:t xml:space="preserve">        (1001, 'Proteins', 'Phe ring breathing', 'up-left'),</w:t>
+      </w:r>
+    </w:p>
+    <w:p>
+      <w:pPr>
+        <w:spacing w:before="0" w:after="0" w:line="240" w:lineRule="auto"/>
+      </w:pPr>
+      <w:r>
+        <w:rPr>
+          <w:rFonts w:ascii="Consolas" w:hAnsi="Consolas" w:eastAsia="Consolas" w:cs="Consolas"/>
+          <w:sz w:val="15"/>
+          <w:noProof/>
+        </w:rPr>
+        <w:t xml:space="preserve">        (1034, 'Proteins', 'Phe C-H in-plane bending', 'up-right'),</w:t>
+      </w:r>
+    </w:p>
+    <w:p>
+      <w:pPr>
+        <w:spacing w:before="0" w:after="0" w:line="240" w:lineRule="auto"/>
+      </w:pPr>
+      <w:r>
+        <w:rPr>
+          <w:rFonts w:ascii="Consolas" w:hAnsi="Consolas" w:eastAsia="Consolas" w:cs="Consolas"/>
+          <w:sz w:val="15"/>
+          <w:noProof/>
+        </w:rPr>
+        <w:t xml:space="preserve">        (1167, 'Proteins', 'Tyr C-H bending; carotenoid C-C', 'up'),</w:t>
+      </w:r>
+    </w:p>
+    <w:p>
+      <w:pPr>
+        <w:spacing w:before="0" w:after="0" w:line="240" w:lineRule="auto"/>
+      </w:pPr>
+      <w:r>
+        <w:rPr>
+          <w:rFonts w:ascii="Consolas" w:hAnsi="Consolas" w:eastAsia="Consolas" w:cs="Consolas"/>
+          <w:sz w:val="15"/>
+          <w:noProof/>
+        </w:rPr>
+        <w:t xml:space="preserve">        (1355, 'Proteins', 'Trp / CH deformation (broad)', 'up'),</w:t>
+      </w:r>
+    </w:p>
+    <w:p>
+      <w:pPr>
+        <w:spacing w:before="0" w:after="0" w:line="240" w:lineRule="auto"/>
+      </w:pPr>
+      <w:r>
+        <w:rPr>
+          <w:rFonts w:ascii="Consolas" w:hAnsi="Consolas" w:eastAsia="Consolas" w:cs="Consolas"/>
+          <w:sz w:val="15"/>
+          <w:noProof/>
+        </w:rPr>
+        <w:t xml:space="preserve">        (1582, None, 'Phe C=C bending; COO- on Ag', 'up-left'),</w:t>
+      </w:r>
+    </w:p>
+    <w:p>
+      <w:pPr>
+        <w:spacing w:before="0" w:after="0" w:line="240" w:lineRule="auto"/>
+      </w:pPr>
+      <w:r>
+        <w:rPr>
+          <w:rFonts w:ascii="Consolas" w:hAnsi="Consolas" w:eastAsia="Consolas" w:cs="Consolas"/>
+          <w:sz w:val="15"/>
+          <w:noProof/>
+        </w:rPr>
+        <w:t xml:space="preserve">        (1602, None, 'Phe/Tyr ring C=C stretching', 'up-right'),</w:t>
+      </w:r>
+    </w:p>
+    <w:p>
+      <w:pPr>
+        <w:spacing w:before="0" w:after="0" w:line="240" w:lineRule="auto"/>
+      </w:pPr>
+      <w:r>
+        <w:rPr>
+          <w:rFonts w:ascii="Consolas" w:hAnsi="Consolas" w:eastAsia="Consolas" w:cs="Consolas"/>
+          <w:sz w:val="15"/>
+          <w:noProof/>
+        </w:rPr>
+        <w:t xml:space="preserve">        (1725, 'Lipids', 'Ester C=O stretching (lipids)', 'up'),</w:t>
+      </w:r>
+    </w:p>
+    <w:p>
+      <w:pPr>
+        <w:spacing w:before="0" w:after="0" w:line="240" w:lineRule="auto"/>
+      </w:pPr>
+      <w:r>
+        <w:rPr>
+          <w:rFonts w:ascii="Consolas" w:hAnsi="Consolas" w:eastAsia="Consolas" w:cs="Consolas"/>
+          <w:sz w:val="15"/>
+          <w:noProof/>
+        </w:rPr>
+        <w:t xml:space="preserve">    ],</w:t>
+      </w:r>
+    </w:p>
+    <w:p>
+      <w:pPr>
+        <w:spacing w:before="0" w:after="0" w:line="240" w:lineRule="auto"/>
+      </w:pPr>
+      <w:r>
+        <w:rPr>
+          <w:rFonts w:ascii="Consolas" w:hAnsi="Consolas" w:eastAsia="Consolas" w:cs="Consolas"/>
+          <w:sz w:val="15"/>
+          <w:noProof/>
+        </w:rPr>
         <w:t>}</w:t>
+      </w:r>
+    </w:p>
+    <w:p>
+      <w:pPr>
+        <w:spacing w:before="0" w:after="0" w:line="240" w:lineRule="auto"/>
+      </w:pPr>
+      <w:r>
+        <w:rPr>
+          <w:rFonts w:ascii="Consolas" w:hAnsi="Consolas" w:eastAsia="Consolas" w:cs="Consolas"/>
+          <w:sz w:val="15"/>
+          <w:noProof/>
+        </w:rPr>
+        <w:t>PEAKS['EV'] = PEAKS[f'EV_{EV_TAG}']</w:t>
       </w:r>
     </w:p>
     <w:p>
@@ -1009,7 +1204,46 @@
           <w:sz w:val="15"/>
           <w:noProof/>
         </w:rPr>
-        <w:t xml:space="preserve">                  'Lipids/NA': [('Lipids/', '#2E75B6'), ('NA', 'k')]}</w:t>
+        <w:t xml:space="preserve">                  'Lipids/NA': [('Lipids/', '#2E75B6'), ('NA', 'k')],</w:t>
+      </w:r>
+    </w:p>
+    <w:p>
+      <w:pPr>
+        <w:spacing w:before="0" w:after="0" w:line="240" w:lineRule="auto"/>
+      </w:pPr>
+      <w:r>
+        <w:rPr>
+          <w:rFonts w:ascii="Consolas" w:hAnsi="Consolas" w:eastAsia="Consolas" w:cs="Consolas"/>
+          <w:sz w:val="15"/>
+          <w:noProof/>
+        </w:rPr>
+        <w:t xml:space="preserve">                  'Lipids': [('Lipids', '#2E75B6')]}</w:t>
+      </w:r>
+    </w:p>
+    <w:p>
+      <w:pPr>
+        <w:spacing w:before="0" w:after="0" w:line="240" w:lineRule="auto"/>
+      </w:pPr>
+      <w:r>
+        <w:rPr>
+          <w:rFonts w:ascii="Consolas" w:hAnsi="Consolas" w:eastAsia="Consolas" w:cs="Consolas"/>
+          <w:sz w:val="15"/>
+          <w:noProof/>
+        </w:rPr>
+        <w:t># extra class word next to a group of numbers, per EV spectrum</w:t>
+      </w:r>
+    </w:p>
+    <w:p>
+      <w:pPr>
+        <w:spacing w:before="0" w:after="0" w:line="240" w:lineRule="auto"/>
+      </w:pPr>
+      <w:r>
+        <w:rPr>
+          <w:rFonts w:ascii="Consolas" w:hAnsi="Consolas" w:eastAsia="Consolas" w:cs="Consolas"/>
+          <w:sz w:val="15"/>
+          <w:noProof/>
+        </w:rPr>
+        <w:t>GROUP_LABELS += {'S1': [], 'S2': [('EV', 1655, 'Proteins')]}[EV_TAG]</w:t>
       </w:r>
     </w:p>
     <w:p>
@@ -1366,6 +1600,32 @@
           <w:sz w:val="15"/>
           <w:noProof/>
         </w:rPr>
+        <w:t>if OFFSET is None:   # lowest NV point sits 60 counts above the highest EV point</w:t>
+      </w:r>
+    </w:p>
+    <w:p>
+      <w:pPr>
+        <w:spacing w:before="0" w:after="0" w:line="240" w:lineRule="auto"/>
+      </w:pPr>
+      <w:r>
+        <w:rPr>
+          <w:rFonts w:ascii="Consolas" w:hAnsi="Consolas" w:eastAsia="Consolas" w:cs="Consolas"/>
+          <w:sz w:val="15"/>
+          <w:noProof/>
+        </w:rPr>
+        <w:t xml:space="preserve">    OFFSET = int(np.ceil((spectra['EV'][1].max() - spectra['NV'][1].min() + 60) / 10) * 10)</w:t>
+      </w:r>
+    </w:p>
+    <w:p>
+      <w:pPr>
+        <w:spacing w:before="0" w:after="0" w:line="240" w:lineRule="auto"/>
+      </w:pPr>
+      <w:r>
+        <w:rPr>
+          <w:rFonts w:ascii="Consolas" w:hAnsi="Consolas" w:eastAsia="Consolas" w:cs="Consolas"/>
+          <w:sz w:val="15"/>
+          <w:noProof/>
+        </w:rPr>
       </w:r>
     </w:p>
     <w:p>
@@ -2077,7 +2337,7 @@
           <w:sz w:val="15"/>
           <w:noProof/>
         </w:rPr>
-        <w:t>ax.text(0.006, 0.20, 'EV Acacia on Ag/SiNWs', transform=ax.transAxes,</w:t>
+        <w:t>ev_xy, ev_txt = {'S1': ((0.006, 0.20), 'EV Acacia on Ag/SiNWs'),</w:t>
       </w:r>
     </w:p>
     <w:p>
@@ -2090,7 +2350,33 @@
           <w:sz w:val="15"/>
           <w:noProof/>
         </w:rPr>
-        <w:t xml:space="preserve">        ha='left', va='bottom', color=C_EV, fontsize=11)</w:t>
+        <w:t xml:space="preserve">                 'S2': ((0.105, 0.24), 'EV Acacia\non Ag/SiNWs')}[EV_TAG]</w:t>
+      </w:r>
+    </w:p>
+    <w:p>
+      <w:pPr>
+        <w:spacing w:before="0" w:after="0" w:line="240" w:lineRule="auto"/>
+      </w:pPr>
+      <w:r>
+        <w:rPr>
+          <w:rFonts w:ascii="Consolas" w:hAnsi="Consolas" w:eastAsia="Consolas" w:cs="Consolas"/>
+          <w:sz w:val="15"/>
+          <w:noProof/>
+        </w:rPr>
+        <w:t>ax.text(*ev_xy, ev_txt, transform=ax.transAxes, ha='left', va='bottom', color=C_EV,</w:t>
+      </w:r>
+    </w:p>
+    <w:p>
+      <w:pPr>
+        <w:spacing w:before="0" w:after="0" w:line="240" w:lineRule="auto"/>
+      </w:pPr>
+      <w:r>
+        <w:rPr>
+          <w:rFonts w:ascii="Consolas" w:hAnsi="Consolas" w:eastAsia="Consolas" w:cs="Consolas"/>
+          <w:sz w:val="15"/>
+          <w:noProof/>
+        </w:rPr>
+        <w:t xml:space="preserve">        fontsize=11)</w:t>
       </w:r>
     </w:p>
     <w:p>

</xml_diff>

<commit_message>
EV S2 vs NV s4a comparison: dashed boxes around compared bands, clear of labels
Co-Authored-By: Claude Opus 5.5 <noreply@anthropic.com>
Claude-Session: https://claude.ai/code/session_01L8hQ8e5u5KmaH4dD9snyRw
</commit_message>
<xml_diff>
--- a/EV_NV_Spectra_Comparison_Code.docx
+++ b/EV_NV_Spectra_Comparison_Code.docx
@@ -633,7 +633,46 @@
           <w:sz w:val="15"/>
           <w:noProof/>
         </w:rPr>
-        <w:t>BOXES = [(775, 890), (1195, 1320), (1515, 1690)]   # dashed comparison regions</w:t>
+        <w:t># dashed comparison regions (boxes around the compared bands), per EV spectrum</w:t>
+      </w:r>
+    </w:p>
+    <w:p>
+      <w:pPr>
+        <w:spacing w:before="0" w:after="0" w:line="240" w:lineRule="auto"/>
+      </w:pPr>
+      <w:r>
+        <w:rPr>
+          <w:rFonts w:ascii="Consolas" w:hAnsi="Consolas" w:eastAsia="Consolas" w:cs="Consolas"/>
+          <w:sz w:val="15"/>
+          <w:noProof/>
+        </w:rPr>
+        <w:t>BOXES = {'S1': [(775, 890), (1195, 1320), (1515, 1690)],</w:t>
+      </w:r>
+    </w:p>
+    <w:p>
+      <w:pPr>
+        <w:spacing w:before="0" w:after="0" w:line="240" w:lineRule="auto"/>
+      </w:pPr>
+      <w:r>
+        <w:rPr>
+          <w:rFonts w:ascii="Consolas" w:hAnsi="Consolas" w:eastAsia="Consolas" w:cs="Consolas"/>
+          <w:sz w:val="15"/>
+          <w:noProof/>
+        </w:rPr>
+        <w:t xml:space="preserve">         'S2': [(758, 880), (962, 1070), (1148, 1184), (1335, 1405), (1550, 1658),</w:t>
+      </w:r>
+    </w:p>
+    <w:p>
+      <w:pPr>
+        <w:spacing w:before="0" w:after="0" w:line="240" w:lineRule="auto"/>
+      </w:pPr>
+      <w:r>
+        <w:rPr>
+          <w:rFonts w:ascii="Consolas" w:hAnsi="Consolas" w:eastAsia="Consolas" w:cs="Consolas"/>
+          <w:sz w:val="15"/>
+          <w:noProof/>
+        </w:rPr>
+        <w:t xml:space="preserve">                (1700, 1752)]}[EV_TAG]</w:t>
       </w:r>
     </w:p>
     <w:p>
@@ -1152,7 +1191,7 @@
           <w:sz w:val="15"/>
           <w:noProof/>
         </w:rPr>
-        <w:t>GROUP_LABELS = [('NV', 1712, 'Proteins')]</w:t>
+        <w:t>GROUP_LABELS = [('NV', {'S1': 1712, 'S2': 1682}[EV_TAG], 'Proteins')]</w:t>
       </w:r>
     </w:p>
     <w:p>
@@ -1243,7 +1282,7 @@
           <w:sz w:val="15"/>
           <w:noProof/>
         </w:rPr>
-        <w:t>GROUP_LABELS += {'S1': [], 'S2': [('EV', 1655, 'Proteins')]}[EV_TAG]</w:t>
+        <w:t>GROUP_LABELS += {'S1': [], 'S2': [('EV', 1682, 'Proteins')]}[EV_TAG]</w:t>
       </w:r>
     </w:p>
     <w:p>

</xml_diff>

<commit_message>
EV S2 vs NV s4a comparison: NV label inside the plot frame
Co-Authored-By: Claude Opus 5.5 <noreply@anthropic.com>
Claude-Session: https://claude.ai/code/session_01L8hQ8e5u5KmaH4dD9snyRw
</commit_message>
<xml_diff>
--- a/EV_NV_Spectra_Comparison_Code.docx
+++ b/EV_NV_Spectra_Comparison_Code.docx
@@ -2350,7 +2350,7 @@
           <w:sz w:val="15"/>
           <w:noProof/>
         </w:rPr>
-        <w:t>ax.text(0.99, 1.012, 'Nanovesicles Acacia on Ag/SiNWs', transform=ax.transAxes,</w:t>
+        <w:t># NV tag: above the frame (S1) or inside the frame, top-left (S2)</w:t>
       </w:r>
     </w:p>
     <w:p>
@@ -2363,7 +2363,59 @@
           <w:sz w:val="15"/>
           <w:noProof/>
         </w:rPr>
-        <w:t xml:space="preserve">        ha='right', va='bottom', color=C_NV, fontsize=11)</w:t>
+        <w:t>nv_xy, nv_ha, nv_va, nv_txt = {</w:t>
+      </w:r>
+    </w:p>
+    <w:p>
+      <w:pPr>
+        <w:spacing w:before="0" w:after="0" w:line="240" w:lineRule="auto"/>
+      </w:pPr>
+      <w:r>
+        <w:rPr>
+          <w:rFonts w:ascii="Consolas" w:hAnsi="Consolas" w:eastAsia="Consolas" w:cs="Consolas"/>
+          <w:sz w:val="15"/>
+          <w:noProof/>
+        </w:rPr>
+        <w:t xml:space="preserve">    'S1': ((0.99, 1.012), 'right', 'bottom', 'Nanovesicles Acacia on Ag/SiNWs'),</w:t>
+      </w:r>
+    </w:p>
+    <w:p>
+      <w:pPr>
+        <w:spacing w:before="0" w:after="0" w:line="240" w:lineRule="auto"/>
+      </w:pPr>
+      <w:r>
+        <w:rPr>
+          <w:rFonts w:ascii="Consolas" w:hAnsi="Consolas" w:eastAsia="Consolas" w:cs="Consolas"/>
+          <w:sz w:val="15"/>
+          <w:noProof/>
+        </w:rPr>
+        <w:t xml:space="preserve">    'S2': ((0.012, 0.975), 'left', 'top', 'Nanovesicles Acacia\non Ag/SiNWs')}[EV_TAG]</w:t>
+      </w:r>
+    </w:p>
+    <w:p>
+      <w:pPr>
+        <w:spacing w:before="0" w:after="0" w:line="240" w:lineRule="auto"/>
+      </w:pPr>
+      <w:r>
+        <w:rPr>
+          <w:rFonts w:ascii="Consolas" w:hAnsi="Consolas" w:eastAsia="Consolas" w:cs="Consolas"/>
+          <w:sz w:val="15"/>
+          <w:noProof/>
+        </w:rPr>
+        <w:t>ax.text(*nv_xy, nv_txt, transform=ax.transAxes,</w:t>
+      </w:r>
+    </w:p>
+    <w:p>
+      <w:pPr>
+        <w:spacing w:before="0" w:after="0" w:line="240" w:lineRule="auto"/>
+      </w:pPr>
+      <w:r>
+        <w:rPr>
+          <w:rFonts w:ascii="Consolas" w:hAnsi="Consolas" w:eastAsia="Consolas" w:cs="Consolas"/>
+          <w:sz w:val="15"/>
+          <w:noProof/>
+        </w:rPr>
+        <w:t xml:space="preserve">        ha=nv_ha, va=nv_va, color=C_NV, fontsize=11)</w:t>
       </w:r>
     </w:p>
     <w:p>

</xml_diff>

<commit_message>
EV S2 vs NV s4a comparison: dotted peak lines instead of band boxes
Co-Authored-By: Claude Opus 5.5 <noreply@anthropic.com>
Claude-Session: https://claude.ai/code/session_01L8hQ8e5u5KmaH4dD9snyRw
</commit_message>
<xml_diff>
--- a/EV_NV_Spectra_Comparison_Code.docx
+++ b/EV_NV_Spectra_Comparison_Code.docx
@@ -646,7 +646,7 @@
           <w:sz w:val="15"/>
           <w:noProof/>
         </w:rPr>
-        <w:t>BOXES = {'S1': [(775, 890), (1195, 1320), (1515, 1690)],</w:t>
+        <w:t>BOXES = {'S1': [(775, 890), (1195, 1320), (1515, 1690)], 'S2': []}[EV_TAG]</w:t>
       </w:r>
     </w:p>
     <w:p>
@@ -659,7 +659,7 @@
           <w:sz w:val="15"/>
           <w:noProof/>
         </w:rPr>
-        <w:t xml:space="preserve">         'S2': [(758, 880), (962, 1070), (1148, 1184), (1335, 1405), (1550, 1658),</w:t>
+        <w:t># dotted vertical line at every labelled peak, from the trace up to its label</w:t>
       </w:r>
     </w:p>
     <w:p>
@@ -672,7 +672,7 @@
           <w:sz w:val="15"/>
           <w:noProof/>
         </w:rPr>
-        <w:t xml:space="preserve">                (1700, 1752)]}[EV_TAG]</w:t>
+        <w:t>PEAK_LINES = {'S1': False, 'S2': True}[EV_TAG]</w:t>
       </w:r>
     </w:p>
     <w:p>
@@ -1805,7 +1805,7 @@
           <w:sz w:val="15"/>
           <w:noProof/>
         </w:rPr>
-        <w:t>rows, labels = [], []</w:t>
+        <w:t>rows, labels, lines = [], [], []</w:t>
       </w:r>
     </w:p>
     <w:p>
@@ -1922,6 +1922,32 @@
           <w:sz w:val="15"/>
           <w:noProof/>
         </w:rPr>
+        <w:t xml:space="preserve">        if PEAK_LINES:   # from just below the trace (local minimum) to the label</w:t>
+      </w:r>
+    </w:p>
+    <w:p>
+      <w:pPr>
+        <w:spacing w:before="0" w:after="0" w:line="240" w:lineRule="auto"/>
+      </w:pPr>
+      <w:r>
+        <w:rPr>
+          <w:rFonts w:ascii="Consolas" w:hAnsi="Consolas" w:eastAsia="Consolas" w:cs="Consolas"/>
+          <w:sz w:val="15"/>
+          <w:noProof/>
+        </w:rPr>
+        <w:t xml:space="preserve">            lines.append([pos, ys_plot[np.abs(x - pos) &lt;= 15].min() + off - 20, None])</w:t>
+      </w:r>
+    </w:p>
+    <w:p>
+      <w:pPr>
+        <w:spacing w:before="0" w:after="0" w:line="240" w:lineRule="auto"/>
+      </w:pPr>
+      <w:r>
+        <w:rPr>
+          <w:rFonts w:ascii="Consolas" w:hAnsi="Consolas" w:eastAsia="Consolas" w:cs="Consolas"/>
+          <w:sz w:val="15"/>
+          <w:noProof/>
+        </w:rPr>
         <w:t xml:space="preserve">        top = ys_plot[np.abs(x - pos) &lt;= 4].max() + off</w:t>
       </w:r>
     </w:p>
@@ -2091,6 +2117,45 @@
           <w:sz w:val="15"/>
           <w:noProof/>
         </w:rPr>
+        <w:t xml:space="preserve">        for ln in lines:                   # line(s) of this label end just below it</w:t>
+      </w:r>
+    </w:p>
+    <w:p>
+      <w:pPr>
+        <w:spacing w:before="0" w:after="0" w:line="240" w:lineRule="auto"/>
+      </w:pPr>
+      <w:r>
+        <w:rPr>
+          <w:rFonts w:ascii="Consolas" w:hAnsi="Consolas" w:eastAsia="Consolas" w:cs="Consolas"/>
+          <w:sz w:val="15"/>
+          <w:noProof/>
+        </w:rPr>
+        <w:t xml:space="preserve">            if ln[2] is None:</w:t>
+      </w:r>
+    </w:p>
+    <w:p>
+      <w:pPr>
+        <w:spacing w:before="0" w:after="0" w:line="240" w:lineRule="auto"/>
+      </w:pPr>
+      <w:r>
+        <w:rPr>
+          <w:rFonts w:ascii="Consolas" w:hAnsi="Consolas" w:eastAsia="Consolas" w:cs="Consolas"/>
+          <w:sz w:val="15"/>
+          <w:noProof/>
+        </w:rPr>
+        <w:t xml:space="preserve">                ln[2] = top + 3</w:t>
+      </w:r>
+    </w:p>
+    <w:p>
+      <w:pPr>
+        <w:spacing w:before="0" w:after="0" w:line="240" w:lineRule="auto"/>
+      </w:pPr>
+      <w:r>
+        <w:rPr>
+          <w:rFonts w:ascii="Consolas" w:hAnsi="Consolas" w:eastAsia="Consolas" w:cs="Consolas"/>
+          <w:sz w:val="15"/>
+          <w:noProof/>
+        </w:rPr>
         <w:t xml:space="preserve">        labels.append((pos + dx, top + 8, segs,</w:t>
       </w:r>
     </w:p>
@@ -2182,6 +2247,32 @@
           <w:noProof/>
         </w:rPr>
         <w:t xml:space="preserve">                           ls='--', lw=0.8, ec='#1F3864'))</w:t>
+      </w:r>
+    </w:p>
+    <w:p>
+      <w:pPr>
+        <w:spacing w:before="0" w:after="0" w:line="240" w:lineRule="auto"/>
+      </w:pPr>
+      <w:r>
+        <w:rPr>
+          <w:rFonts w:ascii="Consolas" w:hAnsi="Consolas" w:eastAsia="Consolas" w:cs="Consolas"/>
+          <w:sz w:val="15"/>
+          <w:noProof/>
+        </w:rPr>
+        <w:t>for xl, yb, yt in lines:</w:t>
+      </w:r>
+    </w:p>
+    <w:p>
+      <w:pPr>
+        <w:spacing w:before="0" w:after="0" w:line="240" w:lineRule="auto"/>
+      </w:pPr>
+      <w:r>
+        <w:rPr>
+          <w:rFonts w:ascii="Consolas" w:hAnsi="Consolas" w:eastAsia="Consolas" w:cs="Consolas"/>
+          <w:sz w:val="15"/>
+          <w:noProof/>
+        </w:rPr>
+        <w:t xml:space="preserve">    ax.plot([xl, xl], [yb, yt], ls=(0, (1, 2)), lw=0.8, color='#1F3864')</w:t>
       </w:r>
     </w:p>
     <w:p>

</xml_diff>